<commit_message>
Agregar macro para limpiar códigos en Word
</commit_message>
<xml_diff>
--- a/ARTICULO DE REVISION/Articulo_De_Revision.docx
+++ b/ARTICULO DE REVISION/Articulo_De_Revision.docx
@@ -743,7 +743,103 @@
         <w:rPr>
           <w:rFonts w:ascii="Times New Roman" w:hAnsi="Times New Roman" w:cs="Times New Roman"/>
         </w:rPr>
-        <w:t>), generando un volumen creciente de datos operacionales provenientes de múltiples fuentes heterogéneas [Q9P1][1], [X7K2][2]. Esta evolución ha permitido mejorar la supervisión, el control y la toma de decisiones en los procesos productivos; sin embargo, también ha incrementado la complejidad asociada a la integración, sincronización y gestión eficiente de dichos datos dentro de ecosistemas industriales cada vez más interconectados [X7K2][2]. En este escenario, la interoperabilidad entre sistemas y la capacidad de coordinar flujos de información en tiempo real se han convertido en requisitos esenciales para sostener la eficiencia, la trazabilidad y la competitividad de las organizaciones industriales [C6Y4][3].</w:t>
+        <w:t xml:space="preserve">), generando un volumen creciente de datos operacionales provenientes de múltiples fuentes heterogéneas </w:t>
+      </w:r>
+      <w:r>
+        <w:rPr>
+          <w:rFonts w:ascii="Times New Roman" w:hAnsi="Times New Roman" w:cs="Times New Roman"/>
+        </w:rPr>
+        <w:t>[</w:t>
+      </w:r>
+      <w:r>
+        <w:rPr>
+          <w:rFonts w:ascii="Times New Roman" w:hAnsi="Times New Roman" w:cs="Times New Roman"/>
+        </w:rPr>
+        <w:t>1</w:t>
+      </w:r>
+      <w:r>
+        <w:rPr>
+          <w:rFonts w:ascii="Times New Roman" w:hAnsi="Times New Roman" w:cs="Times New Roman"/>
+        </w:rPr>
+        <w:t>]</w:t>
+      </w:r>
+      <w:r>
+        <w:rPr>
+          <w:rFonts w:ascii="Times New Roman" w:hAnsi="Times New Roman" w:cs="Times New Roman"/>
+        </w:rPr>
+        <w:t xml:space="preserve">, </w:t>
+      </w:r>
+      <w:r>
+        <w:rPr>
+          <w:rFonts w:ascii="Times New Roman" w:hAnsi="Times New Roman" w:cs="Times New Roman"/>
+        </w:rPr>
+        <w:t>[</w:t>
+      </w:r>
+      <w:r>
+        <w:rPr>
+          <w:rFonts w:ascii="Times New Roman" w:hAnsi="Times New Roman" w:cs="Times New Roman"/>
+        </w:rPr>
+        <w:t>2</w:t>
+      </w:r>
+      <w:r>
+        <w:rPr>
+          <w:rFonts w:ascii="Times New Roman" w:hAnsi="Times New Roman" w:cs="Times New Roman"/>
+        </w:rPr>
+        <w:t>]</w:t>
+      </w:r>
+      <w:r>
+        <w:rPr>
+          <w:rFonts w:ascii="Times New Roman" w:hAnsi="Times New Roman" w:cs="Times New Roman"/>
+        </w:rPr>
+        <w:t xml:space="preserve">. Esta evolución ha permitido mejorar la supervisión, el control y la toma de decisiones en los procesos productivos; sin embargo, también ha incrementado la complejidad asociada a la integración, sincronización y gestión eficiente de dichos datos dentro de ecosistemas industriales cada vez más interconectados </w:t>
+      </w:r>
+      <w:r>
+        <w:rPr>
+          <w:rFonts w:ascii="Times New Roman" w:hAnsi="Times New Roman" w:cs="Times New Roman"/>
+        </w:rPr>
+        <w:t>[</w:t>
+      </w:r>
+      <w:r>
+        <w:rPr>
+          <w:rFonts w:ascii="Times New Roman" w:hAnsi="Times New Roman" w:cs="Times New Roman"/>
+        </w:rPr>
+        <w:t>2</w:t>
+      </w:r>
+      <w:r>
+        <w:rPr>
+          <w:rFonts w:ascii="Times New Roman" w:hAnsi="Times New Roman" w:cs="Times New Roman"/>
+        </w:rPr>
+        <w:t>]</w:t>
+      </w:r>
+      <w:r>
+        <w:rPr>
+          <w:rFonts w:ascii="Times New Roman" w:hAnsi="Times New Roman" w:cs="Times New Roman"/>
+        </w:rPr>
+        <w:t xml:space="preserve">. En este escenario, la interoperabilidad entre sistemas y la capacidad de coordinar flujos de información en tiempo real se han convertido en requisitos esenciales para sostener la eficiencia, la trazabilidad y la competitividad de las organizaciones industriales </w:t>
+      </w:r>
+      <w:r>
+        <w:rPr>
+          <w:rFonts w:ascii="Times New Roman" w:hAnsi="Times New Roman" w:cs="Times New Roman"/>
+        </w:rPr>
+        <w:t>[</w:t>
+      </w:r>
+      <w:r>
+        <w:rPr>
+          <w:rFonts w:ascii="Times New Roman" w:hAnsi="Times New Roman" w:cs="Times New Roman"/>
+        </w:rPr>
+        <w:t>3</w:t>
+      </w:r>
+      <w:r>
+        <w:rPr>
+          <w:rFonts w:ascii="Times New Roman" w:hAnsi="Times New Roman" w:cs="Times New Roman"/>
+        </w:rPr>
+        <w:t>]</w:t>
+      </w:r>
+      <w:r>
+        <w:rPr>
+          <w:rFonts w:ascii="Times New Roman" w:hAnsi="Times New Roman" w:cs="Times New Roman"/>
+        </w:rPr>
+        <w:t>.</w:t>
       </w:r>
     </w:p>
     <w:p>
@@ -757,7 +853,127 @@
         <w:rPr>
           <w:rFonts w:ascii="Times New Roman" w:hAnsi="Times New Roman" w:cs="Times New Roman"/>
         </w:rPr>
-        <w:t>De manera paralela, la Inteligencia Artificial (IA) ha adquirido un papel cada vez más relevante en la industria moderna, al ofrecer herramientas capaces de analizar información compleja, identificar patrones, automatizar decisiones y asistir en la optimización de procesos [Q9P1][1], [C6Y4][3]. Dentro de este campo, los sistemas multiagente han mostrado un notable potencial para distribuir tareas, coordinar componentes especializados y responder de manera flexible a entornos dinámicos, mientras que los modelos de lenguaje de gran escala han ampliado estas capacidades al facilitar razonamiento, planificación, interacción con herramientas y manejo contextual de información [N7D2][4], [K4M7][5]. Como resultado, han surgido nuevas arquitecturas basadas en agentes inteligentes capaces de intervenir en escenarios de automatización, monitoreo, mantenimiento predictivo, soporte operacional e integración de servicios digitales [K4M7][5].</w:t>
+        <w:t xml:space="preserve">De manera paralela, la Inteligencia Artificial (IA) ha adquirido un papel cada vez más relevante en la industria moderna, al ofrecer herramientas capaces de analizar información compleja, identificar patrones, automatizar decisiones y asistir en la optimización de procesos </w:t>
+      </w:r>
+      <w:r>
+        <w:rPr>
+          <w:rFonts w:ascii="Times New Roman" w:hAnsi="Times New Roman" w:cs="Times New Roman"/>
+        </w:rPr>
+        <w:t>[</w:t>
+      </w:r>
+      <w:r>
+        <w:rPr>
+          <w:rFonts w:ascii="Times New Roman" w:hAnsi="Times New Roman" w:cs="Times New Roman"/>
+        </w:rPr>
+        <w:t>1</w:t>
+      </w:r>
+      <w:r>
+        <w:rPr>
+          <w:rFonts w:ascii="Times New Roman" w:hAnsi="Times New Roman" w:cs="Times New Roman"/>
+        </w:rPr>
+        <w:t>]</w:t>
+      </w:r>
+      <w:r>
+        <w:rPr>
+          <w:rFonts w:ascii="Times New Roman" w:hAnsi="Times New Roman" w:cs="Times New Roman"/>
+        </w:rPr>
+        <w:t xml:space="preserve">, </w:t>
+      </w:r>
+      <w:r>
+        <w:rPr>
+          <w:rFonts w:ascii="Times New Roman" w:hAnsi="Times New Roman" w:cs="Times New Roman"/>
+        </w:rPr>
+        <w:t>[</w:t>
+      </w:r>
+      <w:r>
+        <w:rPr>
+          <w:rFonts w:ascii="Times New Roman" w:hAnsi="Times New Roman" w:cs="Times New Roman"/>
+        </w:rPr>
+        <w:t>3</w:t>
+      </w:r>
+      <w:r>
+        <w:rPr>
+          <w:rFonts w:ascii="Times New Roman" w:hAnsi="Times New Roman" w:cs="Times New Roman"/>
+        </w:rPr>
+        <w:t>]</w:t>
+      </w:r>
+      <w:r>
+        <w:rPr>
+          <w:rFonts w:ascii="Times New Roman" w:hAnsi="Times New Roman" w:cs="Times New Roman"/>
+        </w:rPr>
+        <w:t xml:space="preserve">. Dentro de este campo, los sistemas multiagente han mostrado un notable potencial para distribuir tareas, coordinar componentes especializados y responder de manera flexible a entornos dinámicos, mientras que los modelos de lenguaje de gran escala han ampliado estas capacidades al facilitar razonamiento, planificación, interacción con herramientas y manejo contextual de información </w:t>
+      </w:r>
+      <w:r>
+        <w:rPr>
+          <w:rFonts w:ascii="Times New Roman" w:hAnsi="Times New Roman" w:cs="Times New Roman"/>
+        </w:rPr>
+        <w:t>[</w:t>
+      </w:r>
+      <w:r>
+        <w:rPr>
+          <w:rFonts w:ascii="Times New Roman" w:hAnsi="Times New Roman" w:cs="Times New Roman"/>
+        </w:rPr>
+        <w:t>4</w:t>
+      </w:r>
+      <w:r>
+        <w:rPr>
+          <w:rFonts w:ascii="Times New Roman" w:hAnsi="Times New Roman" w:cs="Times New Roman"/>
+        </w:rPr>
+        <w:t>]</w:t>
+      </w:r>
+      <w:r>
+        <w:rPr>
+          <w:rFonts w:ascii="Times New Roman" w:hAnsi="Times New Roman" w:cs="Times New Roman"/>
+        </w:rPr>
+        <w:t xml:space="preserve">, </w:t>
+      </w:r>
+      <w:r>
+        <w:rPr>
+          <w:rFonts w:ascii="Times New Roman" w:hAnsi="Times New Roman" w:cs="Times New Roman"/>
+        </w:rPr>
+        <w:t>[</w:t>
+      </w:r>
+      <w:r>
+        <w:rPr>
+          <w:rFonts w:ascii="Times New Roman" w:hAnsi="Times New Roman" w:cs="Times New Roman"/>
+        </w:rPr>
+        <w:t>5</w:t>
+      </w:r>
+      <w:r>
+        <w:rPr>
+          <w:rFonts w:ascii="Times New Roman" w:hAnsi="Times New Roman" w:cs="Times New Roman"/>
+        </w:rPr>
+        <w:t>]</w:t>
+      </w:r>
+      <w:r>
+        <w:rPr>
+          <w:rFonts w:ascii="Times New Roman" w:hAnsi="Times New Roman" w:cs="Times New Roman"/>
+        </w:rPr>
+        <w:t xml:space="preserve">. Como resultado, han surgido nuevas arquitecturas basadas en agentes inteligentes capaces de intervenir en escenarios de automatización, monitoreo, mantenimiento predictivo, soporte operacional e integración de servicios digitales </w:t>
+      </w:r>
+      <w:r>
+        <w:rPr>
+          <w:rFonts w:ascii="Times New Roman" w:hAnsi="Times New Roman" w:cs="Times New Roman"/>
+        </w:rPr>
+        <w:t>[</w:t>
+      </w:r>
+      <w:r>
+        <w:rPr>
+          <w:rFonts w:ascii="Times New Roman" w:hAnsi="Times New Roman" w:cs="Times New Roman"/>
+        </w:rPr>
+        <w:t>5</w:t>
+      </w:r>
+      <w:r>
+        <w:rPr>
+          <w:rFonts w:ascii="Times New Roman" w:hAnsi="Times New Roman" w:cs="Times New Roman"/>
+        </w:rPr>
+        <w:t>]</w:t>
+      </w:r>
+      <w:r>
+        <w:rPr>
+          <w:rFonts w:ascii="Times New Roman" w:hAnsi="Times New Roman" w:cs="Times New Roman"/>
+        </w:rPr>
+        <w:t>.</w:t>
       </w:r>
     </w:p>
     <w:p>
@@ -821,14 +1037,199 @@
         <w:rPr>
           <w:rFonts w:ascii="Times New Roman" w:hAnsi="Times New Roman" w:cs="Times New Roman"/>
         </w:rPr>
-        <w:t xml:space="preserve"> ha comenzado a posicionarse como un mecanismo relevante para estructurar la comunicación entre agentes inteligentes, herramientas externas, servicios y fuentes de datos [M6P3][6], [X5B9][7]. Su incorporación permite estandarizar el acceso al contexto, mejorar la interoperabilidad y facilitar la orquestación de flujos de trabajo compuestos por múltiples componentes especializados [M6P3][6], [X5B9][7]. En consecuencia, la convergencia entre arquitecturas multiagente basadas en inteligencia artificial y MCP ha despertado un interés creciente en la literatura científica, especialmente por su potencial para fortalecer la orquestación e integración de datos industriales [L6C2][12], [M6P3][6]. No obstante, persisten vacíos respecto a la forma en que estas propuestas han sido desarrolladas, </w:t>
-      </w:r>
-      <w:r>
-        <w:rPr>
-          <w:rFonts w:ascii="Times New Roman" w:hAnsi="Times New Roman" w:cs="Times New Roman"/>
-        </w:rPr>
-        <w:lastRenderedPageBreak/>
-        <w:t>evaluadas y aplicadas, lo que justifica la necesidad de una revisión sistemática que permita sintetizar el estado actual del conocimiento en este campo [X7K2][2], [Q9P1][1].</w:t>
+        <w:t xml:space="preserve"> ha comenzado a posicionarse como un mecanismo relevante para estructurar la comunicación entre agentes inteligentes, herramientas externas, servicios y fuentes de datos </w:t>
+      </w:r>
+      <w:r>
+        <w:rPr>
+          <w:rFonts w:ascii="Times New Roman" w:hAnsi="Times New Roman" w:cs="Times New Roman"/>
+        </w:rPr>
+        <w:t>[</w:t>
+      </w:r>
+      <w:r>
+        <w:rPr>
+          <w:rFonts w:ascii="Times New Roman" w:hAnsi="Times New Roman" w:cs="Times New Roman"/>
+        </w:rPr>
+        <w:t>6</w:t>
+      </w:r>
+      <w:r>
+        <w:rPr>
+          <w:rFonts w:ascii="Times New Roman" w:hAnsi="Times New Roman" w:cs="Times New Roman"/>
+        </w:rPr>
+        <w:t>]</w:t>
+      </w:r>
+      <w:r>
+        <w:rPr>
+          <w:rFonts w:ascii="Times New Roman" w:hAnsi="Times New Roman" w:cs="Times New Roman"/>
+        </w:rPr>
+        <w:t xml:space="preserve">, </w:t>
+      </w:r>
+      <w:r>
+        <w:rPr>
+          <w:rFonts w:ascii="Times New Roman" w:hAnsi="Times New Roman" w:cs="Times New Roman"/>
+        </w:rPr>
+        <w:t>[</w:t>
+      </w:r>
+      <w:r>
+        <w:rPr>
+          <w:rFonts w:ascii="Times New Roman" w:hAnsi="Times New Roman" w:cs="Times New Roman"/>
+        </w:rPr>
+        <w:t>7</w:t>
+      </w:r>
+      <w:r>
+        <w:rPr>
+          <w:rFonts w:ascii="Times New Roman" w:hAnsi="Times New Roman" w:cs="Times New Roman"/>
+        </w:rPr>
+        <w:t>]</w:t>
+      </w:r>
+      <w:r>
+        <w:rPr>
+          <w:rFonts w:ascii="Times New Roman" w:hAnsi="Times New Roman" w:cs="Times New Roman"/>
+        </w:rPr>
+        <w:t xml:space="preserve">. Su incorporación permite estandarizar el acceso al contexto, mejorar la interoperabilidad y facilitar la orquestación de flujos de trabajo compuestos por múltiples componentes especializados </w:t>
+      </w:r>
+      <w:r>
+        <w:rPr>
+          <w:rFonts w:ascii="Times New Roman" w:hAnsi="Times New Roman" w:cs="Times New Roman"/>
+        </w:rPr>
+        <w:t>[</w:t>
+      </w:r>
+      <w:r>
+        <w:rPr>
+          <w:rFonts w:ascii="Times New Roman" w:hAnsi="Times New Roman" w:cs="Times New Roman"/>
+        </w:rPr>
+        <w:t>6</w:t>
+      </w:r>
+      <w:r>
+        <w:rPr>
+          <w:rFonts w:ascii="Times New Roman" w:hAnsi="Times New Roman" w:cs="Times New Roman"/>
+        </w:rPr>
+        <w:t>]</w:t>
+      </w:r>
+      <w:r>
+        <w:rPr>
+          <w:rFonts w:ascii="Times New Roman" w:hAnsi="Times New Roman" w:cs="Times New Roman"/>
+        </w:rPr>
+        <w:t xml:space="preserve">, </w:t>
+      </w:r>
+      <w:r>
+        <w:rPr>
+          <w:rFonts w:ascii="Times New Roman" w:hAnsi="Times New Roman" w:cs="Times New Roman"/>
+        </w:rPr>
+        <w:t>[</w:t>
+      </w:r>
+      <w:r>
+        <w:rPr>
+          <w:rFonts w:ascii="Times New Roman" w:hAnsi="Times New Roman" w:cs="Times New Roman"/>
+        </w:rPr>
+        <w:t>7</w:t>
+      </w:r>
+      <w:r>
+        <w:rPr>
+          <w:rFonts w:ascii="Times New Roman" w:hAnsi="Times New Roman" w:cs="Times New Roman"/>
+        </w:rPr>
+        <w:t>]</w:t>
+      </w:r>
+      <w:r>
+        <w:rPr>
+          <w:rFonts w:ascii="Times New Roman" w:hAnsi="Times New Roman" w:cs="Times New Roman"/>
+        </w:rPr>
+        <w:t xml:space="preserve">. En consecuencia, la convergencia entre arquitecturas multiagente basadas en inteligencia artificial y MCP ha despertado un interés creciente en la literatura científica, especialmente por su potencial para fortalecer la orquestación e integración de datos industriales </w:t>
+      </w:r>
+      <w:r>
+        <w:rPr>
+          <w:rFonts w:ascii="Times New Roman" w:hAnsi="Times New Roman" w:cs="Times New Roman"/>
+        </w:rPr>
+        <w:t>[</w:t>
+      </w:r>
+      <w:r>
+        <w:rPr>
+          <w:rFonts w:ascii="Times New Roman" w:hAnsi="Times New Roman" w:cs="Times New Roman"/>
+        </w:rPr>
+        <w:t>12</w:t>
+      </w:r>
+      <w:r>
+        <w:rPr>
+          <w:rFonts w:ascii="Times New Roman" w:hAnsi="Times New Roman" w:cs="Times New Roman"/>
+        </w:rPr>
+        <w:t>]</w:t>
+      </w:r>
+      <w:r>
+        <w:rPr>
+          <w:rFonts w:ascii="Times New Roman" w:hAnsi="Times New Roman" w:cs="Times New Roman"/>
+        </w:rPr>
+        <w:t xml:space="preserve">, </w:t>
+      </w:r>
+      <w:r>
+        <w:rPr>
+          <w:rFonts w:ascii="Times New Roman" w:hAnsi="Times New Roman" w:cs="Times New Roman"/>
+        </w:rPr>
+        <w:t>[</w:t>
+      </w:r>
+      <w:r>
+        <w:rPr>
+          <w:rFonts w:ascii="Times New Roman" w:hAnsi="Times New Roman" w:cs="Times New Roman"/>
+        </w:rPr>
+        <w:t>6</w:t>
+      </w:r>
+      <w:r>
+        <w:rPr>
+          <w:rFonts w:ascii="Times New Roman" w:hAnsi="Times New Roman" w:cs="Times New Roman"/>
+        </w:rPr>
+        <w:t>]</w:t>
+      </w:r>
+      <w:r>
+        <w:rPr>
+          <w:rFonts w:ascii="Times New Roman" w:hAnsi="Times New Roman" w:cs="Times New Roman"/>
+        </w:rPr>
+        <w:t xml:space="preserve">. No obstante, persisten vacíos respecto a la forma en que estas propuestas han sido desarrolladas, evaluadas y aplicadas, lo que justifica la necesidad de una revisión sistemática que permita sintetizar el estado actual del conocimiento en este campo </w:t>
+      </w:r>
+      <w:r>
+        <w:rPr>
+          <w:rFonts w:ascii="Times New Roman" w:hAnsi="Times New Roman" w:cs="Times New Roman"/>
+        </w:rPr>
+        <w:t>[</w:t>
+      </w:r>
+      <w:r>
+        <w:rPr>
+          <w:rFonts w:ascii="Times New Roman" w:hAnsi="Times New Roman" w:cs="Times New Roman"/>
+        </w:rPr>
+        <w:t>2</w:t>
+      </w:r>
+      <w:r>
+        <w:rPr>
+          <w:rFonts w:ascii="Times New Roman" w:hAnsi="Times New Roman" w:cs="Times New Roman"/>
+        </w:rPr>
+        <w:t>]</w:t>
+      </w:r>
+      <w:r>
+        <w:rPr>
+          <w:rFonts w:ascii="Times New Roman" w:hAnsi="Times New Roman" w:cs="Times New Roman"/>
+        </w:rPr>
+        <w:t xml:space="preserve">, </w:t>
+      </w:r>
+      <w:r>
+        <w:rPr>
+          <w:rFonts w:ascii="Times New Roman" w:hAnsi="Times New Roman" w:cs="Times New Roman"/>
+        </w:rPr>
+        <w:t>[</w:t>
+      </w:r>
+      <w:r>
+        <w:rPr>
+          <w:rFonts w:ascii="Times New Roman" w:hAnsi="Times New Roman" w:cs="Times New Roman"/>
+        </w:rPr>
+        <w:t>1</w:t>
+      </w:r>
+      <w:r>
+        <w:rPr>
+          <w:rFonts w:ascii="Times New Roman" w:hAnsi="Times New Roman" w:cs="Times New Roman"/>
+        </w:rPr>
+        <w:t>]</w:t>
+      </w:r>
+      <w:r>
+        <w:rPr>
+          <w:rFonts w:ascii="Times New Roman" w:hAnsi="Times New Roman" w:cs="Times New Roman"/>
+        </w:rPr>
+        <w:t>.</w:t>
       </w:r>
     </w:p>
     <w:p>
@@ -868,7 +1269,103 @@
         <w:rPr>
           <w:rFonts w:ascii="Times New Roman" w:hAnsi="Times New Roman" w:cs="Times New Roman"/>
         </w:rPr>
-        <w:t>La orquestación e integración de datos industriales constituye un problema central en los procesos de transformación digital, debido a que gran parte de la operación manufacturera moderna depende de la interacción entre múltiples sistemas, dispositivos, plataformas y fuentes de información que no siempre comparten los mismos estándares, formatos ni mecanismos de comunicación [X7K2][2], [Q9P1][1]. Esta heterogeneidad tecnológica dificulta la consolidación de datos en tiempo real, limita la trazabilidad operativa y reduce la capacidad de las organizaciones para tomar decisiones oportunas y fundamentadas [X7K2][2]. En consecuencia, la gestión ineficiente de datos industriales no solo afecta el desempeño técnico de los procesos, sino también la productividad, la competitividad y la capacidad de innovación de las empresas [C6Y4][3].</w:t>
+        <w:t xml:space="preserve">La orquestación e integración de datos industriales constituye un problema central en los procesos de transformación digital, debido a que gran parte de la operación manufacturera moderna depende de la interacción entre múltiples sistemas, dispositivos, plataformas y fuentes de información que no siempre comparten los mismos estándares, formatos ni mecanismos de comunicación </w:t>
+      </w:r>
+      <w:r>
+        <w:rPr>
+          <w:rFonts w:ascii="Times New Roman" w:hAnsi="Times New Roman" w:cs="Times New Roman"/>
+        </w:rPr>
+        <w:t>[</w:t>
+      </w:r>
+      <w:r>
+        <w:rPr>
+          <w:rFonts w:ascii="Times New Roman" w:hAnsi="Times New Roman" w:cs="Times New Roman"/>
+        </w:rPr>
+        <w:t>2</w:t>
+      </w:r>
+      <w:r>
+        <w:rPr>
+          <w:rFonts w:ascii="Times New Roman" w:hAnsi="Times New Roman" w:cs="Times New Roman"/>
+        </w:rPr>
+        <w:t>]</w:t>
+      </w:r>
+      <w:r>
+        <w:rPr>
+          <w:rFonts w:ascii="Times New Roman" w:hAnsi="Times New Roman" w:cs="Times New Roman"/>
+        </w:rPr>
+        <w:t xml:space="preserve">, </w:t>
+      </w:r>
+      <w:r>
+        <w:rPr>
+          <w:rFonts w:ascii="Times New Roman" w:hAnsi="Times New Roman" w:cs="Times New Roman"/>
+        </w:rPr>
+        <w:t>[</w:t>
+      </w:r>
+      <w:r>
+        <w:rPr>
+          <w:rFonts w:ascii="Times New Roman" w:hAnsi="Times New Roman" w:cs="Times New Roman"/>
+        </w:rPr>
+        <w:t>1</w:t>
+      </w:r>
+      <w:r>
+        <w:rPr>
+          <w:rFonts w:ascii="Times New Roman" w:hAnsi="Times New Roman" w:cs="Times New Roman"/>
+        </w:rPr>
+        <w:t>]</w:t>
+      </w:r>
+      <w:r>
+        <w:rPr>
+          <w:rFonts w:ascii="Times New Roman" w:hAnsi="Times New Roman" w:cs="Times New Roman"/>
+        </w:rPr>
+        <w:t xml:space="preserve">. Esta heterogeneidad tecnológica dificulta la consolidación de datos en tiempo real, limita la trazabilidad operativa y reduce la capacidad de las organizaciones para tomar decisiones oportunas y fundamentadas </w:t>
+      </w:r>
+      <w:r>
+        <w:rPr>
+          <w:rFonts w:ascii="Times New Roman" w:hAnsi="Times New Roman" w:cs="Times New Roman"/>
+        </w:rPr>
+        <w:t>[</w:t>
+      </w:r>
+      <w:r>
+        <w:rPr>
+          <w:rFonts w:ascii="Times New Roman" w:hAnsi="Times New Roman" w:cs="Times New Roman"/>
+        </w:rPr>
+        <w:t>2</w:t>
+      </w:r>
+      <w:r>
+        <w:rPr>
+          <w:rFonts w:ascii="Times New Roman" w:hAnsi="Times New Roman" w:cs="Times New Roman"/>
+        </w:rPr>
+        <w:t>]</w:t>
+      </w:r>
+      <w:r>
+        <w:rPr>
+          <w:rFonts w:ascii="Times New Roman" w:hAnsi="Times New Roman" w:cs="Times New Roman"/>
+        </w:rPr>
+        <w:t xml:space="preserve">. En consecuencia, la gestión ineficiente de datos industriales no solo afecta el desempeño técnico de los procesos, sino también la productividad, la competitividad y la capacidad de innovación de las empresas </w:t>
+      </w:r>
+      <w:r>
+        <w:rPr>
+          <w:rFonts w:ascii="Times New Roman" w:hAnsi="Times New Roman" w:cs="Times New Roman"/>
+        </w:rPr>
+        <w:t>[</w:t>
+      </w:r>
+      <w:r>
+        <w:rPr>
+          <w:rFonts w:ascii="Times New Roman" w:hAnsi="Times New Roman" w:cs="Times New Roman"/>
+        </w:rPr>
+        <w:t>3</w:t>
+      </w:r>
+      <w:r>
+        <w:rPr>
+          <w:rFonts w:ascii="Times New Roman" w:hAnsi="Times New Roman" w:cs="Times New Roman"/>
+        </w:rPr>
+        <w:t>]</w:t>
+      </w:r>
+      <w:r>
+        <w:rPr>
+          <w:rFonts w:ascii="Times New Roman" w:hAnsi="Times New Roman" w:cs="Times New Roman"/>
+        </w:rPr>
+        <w:t>.</w:t>
       </w:r>
     </w:p>
     <w:p>
@@ -882,7 +1379,151 @@
         <w:rPr>
           <w:rFonts w:ascii="Times New Roman" w:hAnsi="Times New Roman" w:cs="Times New Roman"/>
         </w:rPr>
-        <w:t>Pese a la importancia de este problema, muchas organizaciones industriales todavía operan con arquitecturas fragmentadas, donde los datos permanecen distribuidos en silos aislados o dependen de integraciones rígidas, costosas y difíciles de escalar [T5W9][8], [J9F5][9]. Esta situación se vuelve especialmente crítica cuando se requiere coordinación entre sensores, sistemas SCADA, plataformas MES, ERP, herramientas analíticas y servicios inteligentes que deben compartir contexto de manera continua [E6M1][10], [U3K7][11]. Bajo estas condiciones, la interoperabilidad insuficiente y la baja capacidad de automatización pueden generar retrasos en el procesamiento de información, duplicidad de tareas, errores de consistencia y menor capacidad de respuesta frente a eventos operativos o decisiones estratégicas [Q9P1][1], [T5W9][8].</w:t>
+        <w:t xml:space="preserve">Pese a la importancia de este problema, muchas organizaciones industriales todavía operan con arquitecturas fragmentadas, donde los datos permanecen distribuidos en silos aislados o dependen de integraciones rígidas, costosas y difíciles de escalar </w:t>
+      </w:r>
+      <w:r>
+        <w:rPr>
+          <w:rFonts w:ascii="Times New Roman" w:hAnsi="Times New Roman" w:cs="Times New Roman"/>
+        </w:rPr>
+        <w:t>[</w:t>
+      </w:r>
+      <w:r>
+        <w:rPr>
+          <w:rFonts w:ascii="Times New Roman" w:hAnsi="Times New Roman" w:cs="Times New Roman"/>
+        </w:rPr>
+        <w:t>8</w:t>
+      </w:r>
+      <w:r>
+        <w:rPr>
+          <w:rFonts w:ascii="Times New Roman" w:hAnsi="Times New Roman" w:cs="Times New Roman"/>
+        </w:rPr>
+        <w:t>]</w:t>
+      </w:r>
+      <w:r>
+        <w:rPr>
+          <w:rFonts w:ascii="Times New Roman" w:hAnsi="Times New Roman" w:cs="Times New Roman"/>
+        </w:rPr>
+        <w:t xml:space="preserve">, </w:t>
+      </w:r>
+      <w:r>
+        <w:rPr>
+          <w:rFonts w:ascii="Times New Roman" w:hAnsi="Times New Roman" w:cs="Times New Roman"/>
+        </w:rPr>
+        <w:t>[</w:t>
+      </w:r>
+      <w:r>
+        <w:rPr>
+          <w:rFonts w:ascii="Times New Roman" w:hAnsi="Times New Roman" w:cs="Times New Roman"/>
+        </w:rPr>
+        <w:t>9</w:t>
+      </w:r>
+      <w:r>
+        <w:rPr>
+          <w:rFonts w:ascii="Times New Roman" w:hAnsi="Times New Roman" w:cs="Times New Roman"/>
+        </w:rPr>
+        <w:t>]</w:t>
+      </w:r>
+      <w:r>
+        <w:rPr>
+          <w:rFonts w:ascii="Times New Roman" w:hAnsi="Times New Roman" w:cs="Times New Roman"/>
+        </w:rPr>
+        <w:t xml:space="preserve">. Esta situación se vuelve especialmente crítica cuando se requiere coordinación entre sensores, sistemas SCADA, plataformas MES, ERP, herramientas analíticas y servicios inteligentes que deben compartir contexto de manera continua </w:t>
+      </w:r>
+      <w:r>
+        <w:rPr>
+          <w:rFonts w:ascii="Times New Roman" w:hAnsi="Times New Roman" w:cs="Times New Roman"/>
+        </w:rPr>
+        <w:t>[</w:t>
+      </w:r>
+      <w:r>
+        <w:rPr>
+          <w:rFonts w:ascii="Times New Roman" w:hAnsi="Times New Roman" w:cs="Times New Roman"/>
+        </w:rPr>
+        <w:t>10</w:t>
+      </w:r>
+      <w:r>
+        <w:rPr>
+          <w:rFonts w:ascii="Times New Roman" w:hAnsi="Times New Roman" w:cs="Times New Roman"/>
+        </w:rPr>
+        <w:t>]</w:t>
+      </w:r>
+      <w:r>
+        <w:rPr>
+          <w:rFonts w:ascii="Times New Roman" w:hAnsi="Times New Roman" w:cs="Times New Roman"/>
+        </w:rPr>
+        <w:t xml:space="preserve">, </w:t>
+      </w:r>
+      <w:r>
+        <w:rPr>
+          <w:rFonts w:ascii="Times New Roman" w:hAnsi="Times New Roman" w:cs="Times New Roman"/>
+        </w:rPr>
+        <w:t>[</w:t>
+      </w:r>
+      <w:r>
+        <w:rPr>
+          <w:rFonts w:ascii="Times New Roman" w:hAnsi="Times New Roman" w:cs="Times New Roman"/>
+        </w:rPr>
+        <w:t>11</w:t>
+      </w:r>
+      <w:r>
+        <w:rPr>
+          <w:rFonts w:ascii="Times New Roman" w:hAnsi="Times New Roman" w:cs="Times New Roman"/>
+        </w:rPr>
+        <w:t>]</w:t>
+      </w:r>
+      <w:r>
+        <w:rPr>
+          <w:rFonts w:ascii="Times New Roman" w:hAnsi="Times New Roman" w:cs="Times New Roman"/>
+        </w:rPr>
+        <w:t xml:space="preserve">. Bajo estas condiciones, la interoperabilidad insuficiente y la baja capacidad de automatización pueden generar retrasos en el procesamiento de información, duplicidad de tareas, errores de consistencia y menor capacidad de respuesta frente a eventos operativos o decisiones estratégicas </w:t>
+      </w:r>
+      <w:r>
+        <w:rPr>
+          <w:rFonts w:ascii="Times New Roman" w:hAnsi="Times New Roman" w:cs="Times New Roman"/>
+        </w:rPr>
+        <w:t>[</w:t>
+      </w:r>
+      <w:r>
+        <w:rPr>
+          <w:rFonts w:ascii="Times New Roman" w:hAnsi="Times New Roman" w:cs="Times New Roman"/>
+        </w:rPr>
+        <w:t>1</w:t>
+      </w:r>
+      <w:r>
+        <w:rPr>
+          <w:rFonts w:ascii="Times New Roman" w:hAnsi="Times New Roman" w:cs="Times New Roman"/>
+        </w:rPr>
+        <w:t>]</w:t>
+      </w:r>
+      <w:r>
+        <w:rPr>
+          <w:rFonts w:ascii="Times New Roman" w:hAnsi="Times New Roman" w:cs="Times New Roman"/>
+        </w:rPr>
+        <w:t xml:space="preserve">, </w:t>
+      </w:r>
+      <w:r>
+        <w:rPr>
+          <w:rFonts w:ascii="Times New Roman" w:hAnsi="Times New Roman" w:cs="Times New Roman"/>
+        </w:rPr>
+        <w:t>[</w:t>
+      </w:r>
+      <w:r>
+        <w:rPr>
+          <w:rFonts w:ascii="Times New Roman" w:hAnsi="Times New Roman" w:cs="Times New Roman"/>
+        </w:rPr>
+        <w:t>8</w:t>
+      </w:r>
+      <w:r>
+        <w:rPr>
+          <w:rFonts w:ascii="Times New Roman" w:hAnsi="Times New Roman" w:cs="Times New Roman"/>
+        </w:rPr>
+        <w:t>]</w:t>
+      </w:r>
+      <w:r>
+        <w:rPr>
+          <w:rFonts w:ascii="Times New Roman" w:hAnsi="Times New Roman" w:cs="Times New Roman"/>
+        </w:rPr>
+        <w:t>.</w:t>
       </w:r>
     </w:p>
     <w:p>
@@ -896,7 +1537,55 @@
         <w:rPr>
           <w:rFonts w:ascii="Times New Roman" w:hAnsi="Times New Roman" w:cs="Times New Roman"/>
         </w:rPr>
-        <w:t xml:space="preserve">En este contexto, surge la necesidad de explorar enfoques tecnológicos que permitan integrar datos heterogéneos, coordinar componentes especializados y automatizar flujos de trabajo de forma más flexible que las arquitecturas tradicionales. Las arquitecturas multiagente basadas en inteligencia artificial representan una alternativa de creciente interés porque permiten distribuir funciones, delegar tareas entre agentes especializados y mejorar la adaptabilidad del sistema frente a entornos industriales dinámicos [N7D2][4], [K4M7][5]. De forma complementaria, el </w:t>
+        <w:t xml:space="preserve">En este contexto, surge la necesidad de explorar enfoques tecnológicos que permitan integrar datos heterogéneos, coordinar componentes especializados y automatizar flujos de trabajo de forma más flexible que las arquitecturas tradicionales. Las arquitecturas multiagente basadas en inteligencia artificial representan una alternativa de creciente interés porque permiten distribuir funciones, delegar tareas entre agentes especializados y mejorar la adaptabilidad del sistema frente a entornos industriales dinámicos </w:t>
+      </w:r>
+      <w:r>
+        <w:rPr>
+          <w:rFonts w:ascii="Times New Roman" w:hAnsi="Times New Roman" w:cs="Times New Roman"/>
+        </w:rPr>
+        <w:t>[</w:t>
+      </w:r>
+      <w:r>
+        <w:rPr>
+          <w:rFonts w:ascii="Times New Roman" w:hAnsi="Times New Roman" w:cs="Times New Roman"/>
+        </w:rPr>
+        <w:t>4</w:t>
+      </w:r>
+      <w:r>
+        <w:rPr>
+          <w:rFonts w:ascii="Times New Roman" w:hAnsi="Times New Roman" w:cs="Times New Roman"/>
+        </w:rPr>
+        <w:t>]</w:t>
+      </w:r>
+      <w:r>
+        <w:rPr>
+          <w:rFonts w:ascii="Times New Roman" w:hAnsi="Times New Roman" w:cs="Times New Roman"/>
+        </w:rPr>
+        <w:t xml:space="preserve">, </w:t>
+      </w:r>
+      <w:r>
+        <w:rPr>
+          <w:rFonts w:ascii="Times New Roman" w:hAnsi="Times New Roman" w:cs="Times New Roman"/>
+        </w:rPr>
+        <w:t>[</w:t>
+      </w:r>
+      <w:r>
+        <w:rPr>
+          <w:rFonts w:ascii="Times New Roman" w:hAnsi="Times New Roman" w:cs="Times New Roman"/>
+        </w:rPr>
+        <w:t>5</w:t>
+      </w:r>
+      <w:r>
+        <w:rPr>
+          <w:rFonts w:ascii="Times New Roman" w:hAnsi="Times New Roman" w:cs="Times New Roman"/>
+        </w:rPr>
+        <w:t>]</w:t>
+      </w:r>
+      <w:r>
+        <w:rPr>
+          <w:rFonts w:ascii="Times New Roman" w:hAnsi="Times New Roman" w:cs="Times New Roman"/>
+        </w:rPr>
+        <w:t xml:space="preserve">. De forma complementaria, el </w:t>
       </w:r>
       <w:r>
         <w:rPr>
@@ -946,7 +1635,79 @@
         <w:rPr>
           <w:rFonts w:ascii="Times New Roman" w:hAnsi="Times New Roman" w:cs="Times New Roman"/>
         </w:rPr>
-        <w:t xml:space="preserve"> ofrece una vía prometedora para estructurar la interacción entre agentes, herramientas y fuentes de datos, facilitando el acceso estandarizado al contexto y fortaleciendo la interoperabilidad entre componentes diversos [M6P3][6], [X5B9][7], [L6C2][12].</w:t>
+        <w:t xml:space="preserve"> ofrece una vía prometedora para estructurar la interacción entre agentes, herramientas y fuentes de datos, facilitando el acceso estandarizado al contexto y fortaleciendo la interoperabilidad entre componentes diversos </w:t>
+      </w:r>
+      <w:r>
+        <w:rPr>
+          <w:rFonts w:ascii="Times New Roman" w:hAnsi="Times New Roman" w:cs="Times New Roman"/>
+        </w:rPr>
+        <w:t>[</w:t>
+      </w:r>
+      <w:r>
+        <w:rPr>
+          <w:rFonts w:ascii="Times New Roman" w:hAnsi="Times New Roman" w:cs="Times New Roman"/>
+        </w:rPr>
+        <w:t>6</w:t>
+      </w:r>
+      <w:r>
+        <w:rPr>
+          <w:rFonts w:ascii="Times New Roman" w:hAnsi="Times New Roman" w:cs="Times New Roman"/>
+        </w:rPr>
+        <w:t>]</w:t>
+      </w:r>
+      <w:r>
+        <w:rPr>
+          <w:rFonts w:ascii="Times New Roman" w:hAnsi="Times New Roman" w:cs="Times New Roman"/>
+        </w:rPr>
+        <w:t xml:space="preserve">, </w:t>
+      </w:r>
+      <w:r>
+        <w:rPr>
+          <w:rFonts w:ascii="Times New Roman" w:hAnsi="Times New Roman" w:cs="Times New Roman"/>
+        </w:rPr>
+        <w:t>[</w:t>
+      </w:r>
+      <w:r>
+        <w:rPr>
+          <w:rFonts w:ascii="Times New Roman" w:hAnsi="Times New Roman" w:cs="Times New Roman"/>
+        </w:rPr>
+        <w:t>7</w:t>
+      </w:r>
+      <w:r>
+        <w:rPr>
+          <w:rFonts w:ascii="Times New Roman" w:hAnsi="Times New Roman" w:cs="Times New Roman"/>
+        </w:rPr>
+        <w:t>]</w:t>
+      </w:r>
+      <w:r>
+        <w:rPr>
+          <w:rFonts w:ascii="Times New Roman" w:hAnsi="Times New Roman" w:cs="Times New Roman"/>
+        </w:rPr>
+        <w:t xml:space="preserve">, </w:t>
+      </w:r>
+      <w:r>
+        <w:rPr>
+          <w:rFonts w:ascii="Times New Roman" w:hAnsi="Times New Roman" w:cs="Times New Roman"/>
+        </w:rPr>
+        <w:t>[</w:t>
+      </w:r>
+      <w:r>
+        <w:rPr>
+          <w:rFonts w:ascii="Times New Roman" w:hAnsi="Times New Roman" w:cs="Times New Roman"/>
+        </w:rPr>
+        <w:t>12</w:t>
+      </w:r>
+      <w:r>
+        <w:rPr>
+          <w:rFonts w:ascii="Times New Roman" w:hAnsi="Times New Roman" w:cs="Times New Roman"/>
+        </w:rPr>
+        <w:t>]</w:t>
+      </w:r>
+      <w:r>
+        <w:rPr>
+          <w:rFonts w:ascii="Times New Roman" w:hAnsi="Times New Roman" w:cs="Times New Roman"/>
+        </w:rPr>
+        <w:t>.</w:t>
       </w:r>
     </w:p>
     <w:p>
@@ -960,14 +1721,86 @@
         <w:rPr>
           <w:rFonts w:ascii="Times New Roman" w:hAnsi="Times New Roman" w:cs="Times New Roman"/>
         </w:rPr>
-        <w:t xml:space="preserve">Por ello, analizar de manera sistemática la literatura científica sobre arquitecturas multiagente basadas en inteligencia artificial y MCP aplicadas a la orquestación e integración de datos industriales resulta relevante tanto en el plano académico como en el plano práctico. Desde la perspectiva científica, permite identificar tendencias, vacíos, métricas, enfoques dominantes y limitaciones metodológicas del campo; desde la perspectiva aplicada, contribuye a reconocer soluciones con potencial real para mejorar </w:t>
+        <w:t xml:space="preserve">Por ello, analizar de manera sistemática la literatura científica sobre arquitecturas multiagente basadas en inteligencia artificial y MCP aplicadas a la orquestación e integración de datos industriales resulta relevante tanto en el plano académico como en el plano práctico. Desde la perspectiva científica, permite identificar tendencias, vacíos, métricas, enfoques dominantes y limitaciones metodológicas del campo; desde la perspectiva aplicada, contribuye a reconocer soluciones con potencial real para mejorar la automatización, la trazabilidad, la eficiencia operativa y la gestión inteligente de datos en la industria </w:t>
+      </w:r>
+      <w:r>
+        <w:rPr>
+          <w:rFonts w:ascii="Times New Roman" w:hAnsi="Times New Roman" w:cs="Times New Roman"/>
+        </w:rPr>
+        <w:t>[</w:t>
+      </w:r>
+      <w:r>
+        <w:rPr>
+          <w:rFonts w:ascii="Times New Roman" w:hAnsi="Times New Roman" w:cs="Times New Roman"/>
+        </w:rPr>
+        <w:t>13</w:t>
+      </w:r>
+      <w:r>
+        <w:rPr>
+          <w:rFonts w:ascii="Times New Roman" w:hAnsi="Times New Roman" w:cs="Times New Roman"/>
+        </w:rPr>
+        <w:t>]</w:t>
+      </w:r>
+      <w:r>
+        <w:rPr>
+          <w:rFonts w:ascii="Times New Roman" w:hAnsi="Times New Roman" w:cs="Times New Roman"/>
+        </w:rPr>
+        <w:t xml:space="preserve">, </w:t>
+      </w:r>
+      <w:r>
+        <w:rPr>
+          <w:rFonts w:ascii="Times New Roman" w:hAnsi="Times New Roman" w:cs="Times New Roman"/>
+        </w:rPr>
+        <w:t>[</w:t>
+      </w:r>
+      <w:r>
+        <w:rPr>
+          <w:rFonts w:ascii="Times New Roman" w:hAnsi="Times New Roman" w:cs="Times New Roman"/>
+        </w:rPr>
+        <w:t>5</w:t>
+      </w:r>
+      <w:r>
+        <w:rPr>
+          <w:rFonts w:ascii="Times New Roman" w:hAnsi="Times New Roman" w:cs="Times New Roman"/>
+        </w:rPr>
+        <w:t>]</w:t>
+      </w:r>
+      <w:r>
+        <w:rPr>
+          <w:rFonts w:ascii="Times New Roman" w:hAnsi="Times New Roman" w:cs="Times New Roman"/>
+        </w:rPr>
+        <w:t xml:space="preserve">. Así, la revisión del problema no solo justifica la pertinencia del </w:t>
       </w:r>
       <w:r>
         <w:rPr>
           <w:rFonts w:ascii="Times New Roman" w:hAnsi="Times New Roman" w:cs="Times New Roman"/>
         </w:rPr>
         <w:lastRenderedPageBreak/>
-        <w:t>la automatización, la trazabilidad, la eficiencia operativa y la gestión inteligente de datos en la industria [U2M5][13], [K4M7][5]. Así, la revisión del problema no solo justifica la pertinencia del estudio, sino que también delimita un área emergente con alto valor estratégico para la Industria 4.0 [F6I1][14].</w:t>
+        <w:t xml:space="preserve">estudio, sino que también delimita un área emergente con alto valor estratégico para la Industria 4.0 </w:t>
+      </w:r>
+      <w:r>
+        <w:rPr>
+          <w:rFonts w:ascii="Times New Roman" w:hAnsi="Times New Roman" w:cs="Times New Roman"/>
+        </w:rPr>
+        <w:t>[</w:t>
+      </w:r>
+      <w:r>
+        <w:rPr>
+          <w:rFonts w:ascii="Times New Roman" w:hAnsi="Times New Roman" w:cs="Times New Roman"/>
+        </w:rPr>
+        <w:t>14</w:t>
+      </w:r>
+      <w:r>
+        <w:rPr>
+          <w:rFonts w:ascii="Times New Roman" w:hAnsi="Times New Roman" w:cs="Times New Roman"/>
+        </w:rPr>
+        <w:t>]</w:t>
+      </w:r>
+      <w:r>
+        <w:rPr>
+          <w:rFonts w:ascii="Times New Roman" w:hAnsi="Times New Roman" w:cs="Times New Roman"/>
+        </w:rPr>
+        <w:t>.</w:t>
       </w:r>
     </w:p>
     <w:p>
@@ -1111,7 +1944,127 @@
         <w:rPr>
           <w:rFonts w:ascii="Times New Roman" w:hAnsi="Times New Roman" w:cs="Times New Roman"/>
         </w:rPr>
-        <w:t>El avance de la inteligencia artificial en el ámbito industrial ha impulsado el desarrollo de soluciones orientadas a mejorar la automatización, la supervisión, la toma de decisiones y la integración de información en entornos productivos complejos [F6I1][14], [Q9P1][1]. En el contexto de la Industria 4.0, estas tecnologías han sido empleadas para abordar múltiples desafíos relacionados con interoperabilidad, coordinación distribuida, análisis de datos en tiempo real y conexión entre plataformas heterogéneas, incluyendo sistemas SCADA, MES, ERP, sensores y servicios inteligentes [X7K2][2], [E6M1][10]. Dentro de este panorama, la orquestación e integración de datos industriales se ha consolidado como una línea de investigación prioritaria por su impacto directo en la eficiencia operativa, la trazabilidad y la capacidad de respuesta de las organizaciones [C6Y4][3].</w:t>
+        <w:t xml:space="preserve">El avance de la inteligencia artificial en el ámbito industrial ha impulsado el desarrollo de soluciones orientadas a mejorar la automatización, la supervisión, la toma de decisiones y la integración de información en entornos productivos complejos </w:t>
+      </w:r>
+      <w:r>
+        <w:rPr>
+          <w:rFonts w:ascii="Times New Roman" w:hAnsi="Times New Roman" w:cs="Times New Roman"/>
+        </w:rPr>
+        <w:t>[</w:t>
+      </w:r>
+      <w:r>
+        <w:rPr>
+          <w:rFonts w:ascii="Times New Roman" w:hAnsi="Times New Roman" w:cs="Times New Roman"/>
+        </w:rPr>
+        <w:t>14</w:t>
+      </w:r>
+      <w:r>
+        <w:rPr>
+          <w:rFonts w:ascii="Times New Roman" w:hAnsi="Times New Roman" w:cs="Times New Roman"/>
+        </w:rPr>
+        <w:t>]</w:t>
+      </w:r>
+      <w:r>
+        <w:rPr>
+          <w:rFonts w:ascii="Times New Roman" w:hAnsi="Times New Roman" w:cs="Times New Roman"/>
+        </w:rPr>
+        <w:t xml:space="preserve">, </w:t>
+      </w:r>
+      <w:r>
+        <w:rPr>
+          <w:rFonts w:ascii="Times New Roman" w:hAnsi="Times New Roman" w:cs="Times New Roman"/>
+        </w:rPr>
+        <w:t>[</w:t>
+      </w:r>
+      <w:r>
+        <w:rPr>
+          <w:rFonts w:ascii="Times New Roman" w:hAnsi="Times New Roman" w:cs="Times New Roman"/>
+        </w:rPr>
+        <w:t>1</w:t>
+      </w:r>
+      <w:r>
+        <w:rPr>
+          <w:rFonts w:ascii="Times New Roman" w:hAnsi="Times New Roman" w:cs="Times New Roman"/>
+        </w:rPr>
+        <w:t>]</w:t>
+      </w:r>
+      <w:r>
+        <w:rPr>
+          <w:rFonts w:ascii="Times New Roman" w:hAnsi="Times New Roman" w:cs="Times New Roman"/>
+        </w:rPr>
+        <w:t xml:space="preserve">. En el contexto de la Industria 4.0, estas tecnologías han sido empleadas para abordar múltiples desafíos relacionados con interoperabilidad, coordinación distribuida, análisis de datos en tiempo real y conexión entre plataformas heterogéneas, incluyendo sistemas SCADA, MES, ERP, sensores y servicios inteligentes </w:t>
+      </w:r>
+      <w:r>
+        <w:rPr>
+          <w:rFonts w:ascii="Times New Roman" w:hAnsi="Times New Roman" w:cs="Times New Roman"/>
+        </w:rPr>
+        <w:t>[</w:t>
+      </w:r>
+      <w:r>
+        <w:rPr>
+          <w:rFonts w:ascii="Times New Roman" w:hAnsi="Times New Roman" w:cs="Times New Roman"/>
+        </w:rPr>
+        <w:t>2</w:t>
+      </w:r>
+      <w:r>
+        <w:rPr>
+          <w:rFonts w:ascii="Times New Roman" w:hAnsi="Times New Roman" w:cs="Times New Roman"/>
+        </w:rPr>
+        <w:t>]</w:t>
+      </w:r>
+      <w:r>
+        <w:rPr>
+          <w:rFonts w:ascii="Times New Roman" w:hAnsi="Times New Roman" w:cs="Times New Roman"/>
+        </w:rPr>
+        <w:t xml:space="preserve">, </w:t>
+      </w:r>
+      <w:r>
+        <w:rPr>
+          <w:rFonts w:ascii="Times New Roman" w:hAnsi="Times New Roman" w:cs="Times New Roman"/>
+        </w:rPr>
+        <w:t>[</w:t>
+      </w:r>
+      <w:r>
+        <w:rPr>
+          <w:rFonts w:ascii="Times New Roman" w:hAnsi="Times New Roman" w:cs="Times New Roman"/>
+        </w:rPr>
+        <w:t>10</w:t>
+      </w:r>
+      <w:r>
+        <w:rPr>
+          <w:rFonts w:ascii="Times New Roman" w:hAnsi="Times New Roman" w:cs="Times New Roman"/>
+        </w:rPr>
+        <w:t>]</w:t>
+      </w:r>
+      <w:r>
+        <w:rPr>
+          <w:rFonts w:ascii="Times New Roman" w:hAnsi="Times New Roman" w:cs="Times New Roman"/>
+        </w:rPr>
+        <w:t xml:space="preserve">. Dentro de este panorama, la orquestación e integración de datos industriales se ha consolidado como una línea de investigación prioritaria por su impacto directo en la eficiencia operativa, la trazabilidad y la capacidad de respuesta de las organizaciones </w:t>
+      </w:r>
+      <w:r>
+        <w:rPr>
+          <w:rFonts w:ascii="Times New Roman" w:hAnsi="Times New Roman" w:cs="Times New Roman"/>
+        </w:rPr>
+        <w:t>[</w:t>
+      </w:r>
+      <w:r>
+        <w:rPr>
+          <w:rFonts w:ascii="Times New Roman" w:hAnsi="Times New Roman" w:cs="Times New Roman"/>
+        </w:rPr>
+        <w:t>3</w:t>
+      </w:r>
+      <w:r>
+        <w:rPr>
+          <w:rFonts w:ascii="Times New Roman" w:hAnsi="Times New Roman" w:cs="Times New Roman"/>
+        </w:rPr>
+        <w:t>]</w:t>
+      </w:r>
+      <w:r>
+        <w:rPr>
+          <w:rFonts w:ascii="Times New Roman" w:hAnsi="Times New Roman" w:cs="Times New Roman"/>
+        </w:rPr>
+        <w:t>.</w:t>
       </w:r>
     </w:p>
     <w:p>
@@ -1125,8 +2078,134 @@
         <w:rPr>
           <w:rFonts w:ascii="Times New Roman" w:hAnsi="Times New Roman" w:cs="Times New Roman"/>
         </w:rPr>
+        <w:t xml:space="preserve">Diversas investigaciones han reportado la aplicación de arquitecturas multiagente para modelar, coordinar y automatizar procesos industriales a partir de componentes especializados capaces de compartir información, delegar tareas y actuar sobre distintos niveles del sistema </w:t>
+      </w:r>
+      <w:r>
+        <w:rPr>
+          <w:rFonts w:ascii="Times New Roman" w:hAnsi="Times New Roman" w:cs="Times New Roman"/>
+        </w:rPr>
+        <w:t>[</w:t>
+      </w:r>
+      <w:r>
+        <w:rPr>
+          <w:rFonts w:ascii="Times New Roman" w:hAnsi="Times New Roman" w:cs="Times New Roman"/>
+        </w:rPr>
+        <w:t>4</w:t>
+      </w:r>
+      <w:r>
+        <w:rPr>
+          <w:rFonts w:ascii="Times New Roman" w:hAnsi="Times New Roman" w:cs="Times New Roman"/>
+        </w:rPr>
+        <w:t>]</w:t>
+      </w:r>
+      <w:r>
+        <w:rPr>
+          <w:rFonts w:ascii="Times New Roman" w:hAnsi="Times New Roman" w:cs="Times New Roman"/>
+        </w:rPr>
+        <w:t xml:space="preserve">, </w:t>
+      </w:r>
+      <w:r>
+        <w:rPr>
+          <w:rFonts w:ascii="Times New Roman" w:hAnsi="Times New Roman" w:cs="Times New Roman"/>
+        </w:rPr>
+        <w:t>[</w:t>
+      </w:r>
+      <w:r>
+        <w:rPr>
+          <w:rFonts w:ascii="Times New Roman" w:hAnsi="Times New Roman" w:cs="Times New Roman"/>
+        </w:rPr>
+        <w:t>13</w:t>
+      </w:r>
+      <w:r>
+        <w:rPr>
+          <w:rFonts w:ascii="Times New Roman" w:hAnsi="Times New Roman" w:cs="Times New Roman"/>
+        </w:rPr>
+        <w:t>]</w:t>
+      </w:r>
+      <w:r>
+        <w:rPr>
+          <w:rFonts w:ascii="Times New Roman" w:hAnsi="Times New Roman" w:cs="Times New Roman"/>
+        </w:rPr>
+        <w:t xml:space="preserve">. Entre los enfoques más utilizados se encuentran las </w:t>
+      </w:r>
+      <w:r>
+        <w:rPr>
+          <w:rFonts w:ascii="Times New Roman" w:hAnsi="Times New Roman" w:cs="Times New Roman"/>
+        </w:rPr>
         <w:lastRenderedPageBreak/>
-        <w:t>Diversas investigaciones han reportado la aplicación de arquitecturas multiagente para modelar, coordinar y automatizar procesos industriales a partir de componentes especializados capaces de compartir información, delegar tareas y actuar sobre distintos niveles del sistema [N7D2][4], [U2M5][13]. Entre los enfoques más utilizados se encuentran las arquitecturas basadas en agentes colaborativos, agentes jerárquicos, marcos de integración semántica y mecanismos de comunicación distribuidos, los cuales han demostrado capacidad para vincular múltiples fuentes de datos y sostener interacciones más flexibles que las integraciones monolíticas tradicionales [T5W9][8], [U2M5][13]. A ello se suma la incorporación reciente de agentes basados en modelos de lenguaje de gran escala, cuya participación ha ampliado las posibilidades de razonamiento, planificación, interacción contextual y uso de herramientas en escenarios industriales [K4M7][5].</w:t>
+        <w:t xml:space="preserve">arquitecturas basadas en agentes colaborativos, agentes jerárquicos, marcos de integración semántica y mecanismos de comunicación distribuidos, los cuales han demostrado capacidad para vincular múltiples fuentes de datos y sostener interacciones más flexibles que las integraciones monolíticas tradicionales </w:t>
+      </w:r>
+      <w:r>
+        <w:rPr>
+          <w:rFonts w:ascii="Times New Roman" w:hAnsi="Times New Roman" w:cs="Times New Roman"/>
+        </w:rPr>
+        <w:t>[</w:t>
+      </w:r>
+      <w:r>
+        <w:rPr>
+          <w:rFonts w:ascii="Times New Roman" w:hAnsi="Times New Roman" w:cs="Times New Roman"/>
+        </w:rPr>
+        <w:t>8</w:t>
+      </w:r>
+      <w:r>
+        <w:rPr>
+          <w:rFonts w:ascii="Times New Roman" w:hAnsi="Times New Roman" w:cs="Times New Roman"/>
+        </w:rPr>
+        <w:t>]</w:t>
+      </w:r>
+      <w:r>
+        <w:rPr>
+          <w:rFonts w:ascii="Times New Roman" w:hAnsi="Times New Roman" w:cs="Times New Roman"/>
+        </w:rPr>
+        <w:t xml:space="preserve">, </w:t>
+      </w:r>
+      <w:r>
+        <w:rPr>
+          <w:rFonts w:ascii="Times New Roman" w:hAnsi="Times New Roman" w:cs="Times New Roman"/>
+        </w:rPr>
+        <w:t>[</w:t>
+      </w:r>
+      <w:r>
+        <w:rPr>
+          <w:rFonts w:ascii="Times New Roman" w:hAnsi="Times New Roman" w:cs="Times New Roman"/>
+        </w:rPr>
+        <w:t>13</w:t>
+      </w:r>
+      <w:r>
+        <w:rPr>
+          <w:rFonts w:ascii="Times New Roman" w:hAnsi="Times New Roman" w:cs="Times New Roman"/>
+        </w:rPr>
+        <w:t>]</w:t>
+      </w:r>
+      <w:r>
+        <w:rPr>
+          <w:rFonts w:ascii="Times New Roman" w:hAnsi="Times New Roman" w:cs="Times New Roman"/>
+        </w:rPr>
+        <w:t xml:space="preserve">. A ello se suma la incorporación reciente de agentes basados en modelos de lenguaje de gran escala, cuya participación ha ampliado las posibilidades de razonamiento, planificación, interacción contextual y uso de herramientas en escenarios industriales </w:t>
+      </w:r>
+      <w:r>
+        <w:rPr>
+          <w:rFonts w:ascii="Times New Roman" w:hAnsi="Times New Roman" w:cs="Times New Roman"/>
+        </w:rPr>
+        <w:t>[</w:t>
+      </w:r>
+      <w:r>
+        <w:rPr>
+          <w:rFonts w:ascii="Times New Roman" w:hAnsi="Times New Roman" w:cs="Times New Roman"/>
+        </w:rPr>
+        <w:t>5</w:t>
+      </w:r>
+      <w:r>
+        <w:rPr>
+          <w:rFonts w:ascii="Times New Roman" w:hAnsi="Times New Roman" w:cs="Times New Roman"/>
+        </w:rPr>
+        <w:t>]</w:t>
+      </w:r>
+      <w:r>
+        <w:rPr>
+          <w:rFonts w:ascii="Times New Roman" w:hAnsi="Times New Roman" w:cs="Times New Roman"/>
+        </w:rPr>
+        <w:t>.</w:t>
       </w:r>
     </w:p>
     <w:p>
@@ -1190,7 +2269,55 @@
         <w:rPr>
           <w:rFonts w:ascii="Times New Roman" w:hAnsi="Times New Roman" w:cs="Times New Roman"/>
         </w:rPr>
-        <w:t xml:space="preserve"> ha favorecido el desarrollo de propuestas orientadas a estructurar la comunicación entre agentes inteligentes, herramientas externas y fuentes de datos, permitiendo un acceso más estandarizado al contexto de trabajo [M6P3][6], [X5B9][7]. Estas investigaciones incorporan servidores MCP, sincronización dinámica de herramientas, flujos de trabajo </w:t>
+        <w:t xml:space="preserve"> ha favorecido el desarrollo de propuestas orientadas a estructurar la comunicación entre agentes inteligentes, herramientas externas y fuentes de datos, permitiendo un acceso más estandarizado al contexto de trabajo </w:t>
+      </w:r>
+      <w:r>
+        <w:rPr>
+          <w:rFonts w:ascii="Times New Roman" w:hAnsi="Times New Roman" w:cs="Times New Roman"/>
+        </w:rPr>
+        <w:t>[</w:t>
+      </w:r>
+      <w:r>
+        <w:rPr>
+          <w:rFonts w:ascii="Times New Roman" w:hAnsi="Times New Roman" w:cs="Times New Roman"/>
+        </w:rPr>
+        <w:t>6</w:t>
+      </w:r>
+      <w:r>
+        <w:rPr>
+          <w:rFonts w:ascii="Times New Roman" w:hAnsi="Times New Roman" w:cs="Times New Roman"/>
+        </w:rPr>
+        <w:t>]</w:t>
+      </w:r>
+      <w:r>
+        <w:rPr>
+          <w:rFonts w:ascii="Times New Roman" w:hAnsi="Times New Roman" w:cs="Times New Roman"/>
+        </w:rPr>
+        <w:t xml:space="preserve">, </w:t>
+      </w:r>
+      <w:r>
+        <w:rPr>
+          <w:rFonts w:ascii="Times New Roman" w:hAnsi="Times New Roman" w:cs="Times New Roman"/>
+        </w:rPr>
+        <w:t>[</w:t>
+      </w:r>
+      <w:r>
+        <w:rPr>
+          <w:rFonts w:ascii="Times New Roman" w:hAnsi="Times New Roman" w:cs="Times New Roman"/>
+        </w:rPr>
+        <w:t>7</w:t>
+      </w:r>
+      <w:r>
+        <w:rPr>
+          <w:rFonts w:ascii="Times New Roman" w:hAnsi="Times New Roman" w:cs="Times New Roman"/>
+        </w:rPr>
+        <w:t>]</w:t>
+      </w:r>
+      <w:r>
+        <w:rPr>
+          <w:rFonts w:ascii="Times New Roman" w:hAnsi="Times New Roman" w:cs="Times New Roman"/>
+        </w:rPr>
+        <w:t xml:space="preserve">. Estas investigaciones incorporan servidores MCP, sincronización dinámica de herramientas, flujos de trabajo </w:t>
       </w:r>
       <w:proofErr w:type="spellStart"/>
       <w:r>
@@ -1204,7 +2331,55 @@
         <w:rPr>
           <w:rFonts w:ascii="Times New Roman" w:hAnsi="Times New Roman" w:cs="Times New Roman"/>
         </w:rPr>
-        <w:t xml:space="preserve"> y modelos de conexión con sistemas industriales y entornos de gestión de datos, con el propósito de mejorar la interoperabilidad, la escalabilidad y la coordinación entre componentes heterogéneos [L6C2][12], [M6P3][6]. En consecuencia, el estado del arte muestra una convergencia cada vez más clara entre arquitecturas multiagente, agentes LLM y protocolos de contexto como MCP.</w:t>
+        <w:t xml:space="preserve"> y modelos de conexión con sistemas industriales y entornos de gestión de datos, con el propósito de mejorar la interoperabilidad, la escalabilidad y la coordinación entre componentes heterogéneos </w:t>
+      </w:r>
+      <w:r>
+        <w:rPr>
+          <w:rFonts w:ascii="Times New Roman" w:hAnsi="Times New Roman" w:cs="Times New Roman"/>
+        </w:rPr>
+        <w:t>[</w:t>
+      </w:r>
+      <w:r>
+        <w:rPr>
+          <w:rFonts w:ascii="Times New Roman" w:hAnsi="Times New Roman" w:cs="Times New Roman"/>
+        </w:rPr>
+        <w:t>12</w:t>
+      </w:r>
+      <w:r>
+        <w:rPr>
+          <w:rFonts w:ascii="Times New Roman" w:hAnsi="Times New Roman" w:cs="Times New Roman"/>
+        </w:rPr>
+        <w:t>]</w:t>
+      </w:r>
+      <w:r>
+        <w:rPr>
+          <w:rFonts w:ascii="Times New Roman" w:hAnsi="Times New Roman" w:cs="Times New Roman"/>
+        </w:rPr>
+        <w:t xml:space="preserve">, </w:t>
+      </w:r>
+      <w:r>
+        <w:rPr>
+          <w:rFonts w:ascii="Times New Roman" w:hAnsi="Times New Roman" w:cs="Times New Roman"/>
+        </w:rPr>
+        <w:t>[</w:t>
+      </w:r>
+      <w:r>
+        <w:rPr>
+          <w:rFonts w:ascii="Times New Roman" w:hAnsi="Times New Roman" w:cs="Times New Roman"/>
+        </w:rPr>
+        <w:t>6</w:t>
+      </w:r>
+      <w:r>
+        <w:rPr>
+          <w:rFonts w:ascii="Times New Roman" w:hAnsi="Times New Roman" w:cs="Times New Roman"/>
+        </w:rPr>
+        <w:t>]</w:t>
+      </w:r>
+      <w:r>
+        <w:rPr>
+          <w:rFonts w:ascii="Times New Roman" w:hAnsi="Times New Roman" w:cs="Times New Roman"/>
+        </w:rPr>
+        <w:t>. En consecuencia, el estado del arte muestra una convergencia cada vez más clara entre arquitecturas multiagente, agentes LLM y protocolos de contexto como MCP.</w:t>
       </w:r>
     </w:p>
     <w:p>
@@ -1218,7 +2393,103 @@
         <w:rPr>
           <w:rFonts w:ascii="Times New Roman" w:hAnsi="Times New Roman" w:cs="Times New Roman"/>
         </w:rPr>
-        <w:t>Asimismo, el interés científico por estas propuestas ha experimentado un crecimiento sostenido en los últimos años, impulsado por la expansión de la transformación digital, la necesidad de automatizar flujos complejos de información y la búsqueda de soluciones más adaptables para la integración de datos industriales [Q9P1][1], [M6P3][6]. Como resultado, la literatura especializada presenta una diversidad creciente de enfoques metodológicos, dominios de aplicación y métricas de evaluación, evidenciando el carácter dinámico, emergente y multidisciplinario de esta línea de investigación [X7K2][2], [K4M7][5].</w:t>
+        <w:t xml:space="preserve">Asimismo, el interés científico por estas propuestas ha experimentado un crecimiento sostenido en los últimos años, impulsado por la expansión de la transformación digital, la necesidad de automatizar flujos complejos de información y la búsqueda de soluciones más adaptables para la integración de datos industriales </w:t>
+      </w:r>
+      <w:r>
+        <w:rPr>
+          <w:rFonts w:ascii="Times New Roman" w:hAnsi="Times New Roman" w:cs="Times New Roman"/>
+        </w:rPr>
+        <w:t>[</w:t>
+      </w:r>
+      <w:r>
+        <w:rPr>
+          <w:rFonts w:ascii="Times New Roman" w:hAnsi="Times New Roman" w:cs="Times New Roman"/>
+        </w:rPr>
+        <w:t>1</w:t>
+      </w:r>
+      <w:r>
+        <w:rPr>
+          <w:rFonts w:ascii="Times New Roman" w:hAnsi="Times New Roman" w:cs="Times New Roman"/>
+        </w:rPr>
+        <w:t>]</w:t>
+      </w:r>
+      <w:r>
+        <w:rPr>
+          <w:rFonts w:ascii="Times New Roman" w:hAnsi="Times New Roman" w:cs="Times New Roman"/>
+        </w:rPr>
+        <w:t xml:space="preserve">, </w:t>
+      </w:r>
+      <w:r>
+        <w:rPr>
+          <w:rFonts w:ascii="Times New Roman" w:hAnsi="Times New Roman" w:cs="Times New Roman"/>
+        </w:rPr>
+        <w:t>[</w:t>
+      </w:r>
+      <w:r>
+        <w:rPr>
+          <w:rFonts w:ascii="Times New Roman" w:hAnsi="Times New Roman" w:cs="Times New Roman"/>
+        </w:rPr>
+        <w:t>6</w:t>
+      </w:r>
+      <w:r>
+        <w:rPr>
+          <w:rFonts w:ascii="Times New Roman" w:hAnsi="Times New Roman" w:cs="Times New Roman"/>
+        </w:rPr>
+        <w:t>]</w:t>
+      </w:r>
+      <w:r>
+        <w:rPr>
+          <w:rFonts w:ascii="Times New Roman" w:hAnsi="Times New Roman" w:cs="Times New Roman"/>
+        </w:rPr>
+        <w:t xml:space="preserve">. Como resultado, la literatura especializada presenta una diversidad creciente de enfoques metodológicos, dominios de aplicación y métricas de evaluación, evidenciando el carácter dinámico, emergente y multidisciplinario de esta línea de investigación </w:t>
+      </w:r>
+      <w:r>
+        <w:rPr>
+          <w:rFonts w:ascii="Times New Roman" w:hAnsi="Times New Roman" w:cs="Times New Roman"/>
+        </w:rPr>
+        <w:t>[</w:t>
+      </w:r>
+      <w:r>
+        <w:rPr>
+          <w:rFonts w:ascii="Times New Roman" w:hAnsi="Times New Roman" w:cs="Times New Roman"/>
+        </w:rPr>
+        <w:t>2</w:t>
+      </w:r>
+      <w:r>
+        <w:rPr>
+          <w:rFonts w:ascii="Times New Roman" w:hAnsi="Times New Roman" w:cs="Times New Roman"/>
+        </w:rPr>
+        <w:t>]</w:t>
+      </w:r>
+      <w:r>
+        <w:rPr>
+          <w:rFonts w:ascii="Times New Roman" w:hAnsi="Times New Roman" w:cs="Times New Roman"/>
+        </w:rPr>
+        <w:t xml:space="preserve">, </w:t>
+      </w:r>
+      <w:r>
+        <w:rPr>
+          <w:rFonts w:ascii="Times New Roman" w:hAnsi="Times New Roman" w:cs="Times New Roman"/>
+        </w:rPr>
+        <w:t>[</w:t>
+      </w:r>
+      <w:r>
+        <w:rPr>
+          <w:rFonts w:ascii="Times New Roman" w:hAnsi="Times New Roman" w:cs="Times New Roman"/>
+        </w:rPr>
+        <w:t>5</w:t>
+      </w:r>
+      <w:r>
+        <w:rPr>
+          <w:rFonts w:ascii="Times New Roman" w:hAnsi="Times New Roman" w:cs="Times New Roman"/>
+        </w:rPr>
+        <w:t>]</w:t>
+      </w:r>
+      <w:r>
+        <w:rPr>
+          <w:rFonts w:ascii="Times New Roman" w:hAnsi="Times New Roman" w:cs="Times New Roman"/>
+        </w:rPr>
+        <w:t>.</w:t>
       </w:r>
     </w:p>
     <w:p>
@@ -1258,7 +2529,103 @@
         <w:rPr>
           <w:rFonts w:ascii="Times New Roman" w:hAnsi="Times New Roman" w:cs="Times New Roman"/>
         </w:rPr>
-        <w:t>A pesar del creciente número de investigaciones relacionadas con arquitecturas multiagente, agentes basados en modelos de lenguaje y mecanismos de interoperabilidad para automatización industrial, la evidencia disponible sobre su aplicación específica a la orquestación e integración de datos industriales permanece fragmentada y dispersa en distintos dominios, contextos operativos y enfoques metodológicos [Q9P1][1], [N7D2][4]. Los estudios publicados emplean diferentes arquitecturas, herramientas, protocolos, entornos de validación y métricas de desempeño, lo que dificulta la comparación sistemática de los resultados obtenidos y limita la identificación de prácticas metodológicas comunes para este campo emergente [X7K2][2], [M6P3][6].</w:t>
+        <w:t xml:space="preserve">A pesar del creciente número de investigaciones relacionadas con arquitecturas multiagente, agentes basados en modelos de lenguaje y mecanismos de interoperabilidad para automatización industrial, la evidencia disponible sobre su aplicación específica a la orquestación e integración de datos industriales permanece fragmentada y dispersa en distintos dominios, contextos operativos y enfoques metodológicos </w:t>
+      </w:r>
+      <w:r>
+        <w:rPr>
+          <w:rFonts w:ascii="Times New Roman" w:hAnsi="Times New Roman" w:cs="Times New Roman"/>
+        </w:rPr>
+        <w:t>[</w:t>
+      </w:r>
+      <w:r>
+        <w:rPr>
+          <w:rFonts w:ascii="Times New Roman" w:hAnsi="Times New Roman" w:cs="Times New Roman"/>
+        </w:rPr>
+        <w:t>1</w:t>
+      </w:r>
+      <w:r>
+        <w:rPr>
+          <w:rFonts w:ascii="Times New Roman" w:hAnsi="Times New Roman" w:cs="Times New Roman"/>
+        </w:rPr>
+        <w:t>]</w:t>
+      </w:r>
+      <w:r>
+        <w:rPr>
+          <w:rFonts w:ascii="Times New Roman" w:hAnsi="Times New Roman" w:cs="Times New Roman"/>
+        </w:rPr>
+        <w:t xml:space="preserve">, </w:t>
+      </w:r>
+      <w:r>
+        <w:rPr>
+          <w:rFonts w:ascii="Times New Roman" w:hAnsi="Times New Roman" w:cs="Times New Roman"/>
+        </w:rPr>
+        <w:t>[</w:t>
+      </w:r>
+      <w:r>
+        <w:rPr>
+          <w:rFonts w:ascii="Times New Roman" w:hAnsi="Times New Roman" w:cs="Times New Roman"/>
+        </w:rPr>
+        <w:t>4</w:t>
+      </w:r>
+      <w:r>
+        <w:rPr>
+          <w:rFonts w:ascii="Times New Roman" w:hAnsi="Times New Roman" w:cs="Times New Roman"/>
+        </w:rPr>
+        <w:t>]</w:t>
+      </w:r>
+      <w:r>
+        <w:rPr>
+          <w:rFonts w:ascii="Times New Roman" w:hAnsi="Times New Roman" w:cs="Times New Roman"/>
+        </w:rPr>
+        <w:t xml:space="preserve">. Los estudios publicados emplean diferentes arquitecturas, herramientas, protocolos, entornos de validación y métricas de desempeño, lo que dificulta la comparación sistemática de los resultados obtenidos y limita la identificación de prácticas metodológicas comunes para este campo emergente </w:t>
+      </w:r>
+      <w:r>
+        <w:rPr>
+          <w:rFonts w:ascii="Times New Roman" w:hAnsi="Times New Roman" w:cs="Times New Roman"/>
+        </w:rPr>
+        <w:t>[</w:t>
+      </w:r>
+      <w:r>
+        <w:rPr>
+          <w:rFonts w:ascii="Times New Roman" w:hAnsi="Times New Roman" w:cs="Times New Roman"/>
+        </w:rPr>
+        <w:t>2</w:t>
+      </w:r>
+      <w:r>
+        <w:rPr>
+          <w:rFonts w:ascii="Times New Roman" w:hAnsi="Times New Roman" w:cs="Times New Roman"/>
+        </w:rPr>
+        <w:t>]</w:t>
+      </w:r>
+      <w:r>
+        <w:rPr>
+          <w:rFonts w:ascii="Times New Roman" w:hAnsi="Times New Roman" w:cs="Times New Roman"/>
+        </w:rPr>
+        <w:t xml:space="preserve">, </w:t>
+      </w:r>
+      <w:r>
+        <w:rPr>
+          <w:rFonts w:ascii="Times New Roman" w:hAnsi="Times New Roman" w:cs="Times New Roman"/>
+        </w:rPr>
+        <w:t>[</w:t>
+      </w:r>
+      <w:r>
+        <w:rPr>
+          <w:rFonts w:ascii="Times New Roman" w:hAnsi="Times New Roman" w:cs="Times New Roman"/>
+        </w:rPr>
+        <w:t>6</w:t>
+      </w:r>
+      <w:r>
+        <w:rPr>
+          <w:rFonts w:ascii="Times New Roman" w:hAnsi="Times New Roman" w:cs="Times New Roman"/>
+        </w:rPr>
+        <w:t>]</w:t>
+      </w:r>
+      <w:r>
+        <w:rPr>
+          <w:rFonts w:ascii="Times New Roman" w:hAnsi="Times New Roman" w:cs="Times New Roman"/>
+        </w:rPr>
+        <w:t>.</w:t>
       </w:r>
     </w:p>
     <w:p>
@@ -1272,58 +2639,184 @@
         <w:rPr>
           <w:rFonts w:ascii="Times New Roman" w:hAnsi="Times New Roman" w:cs="Times New Roman"/>
         </w:rPr>
+        <w:t xml:space="preserve">Asimismo, persisten diferencias significativas en la forma en que las investigaciones evalúan la interoperabilidad, la coordinación entre agentes, la integración semántica, la trazabilidad, la latencia y la capacidad de automatización de las soluciones propuestas. Esta situación complica establecer con claridad qué arquitecturas son más utilizadas, qué rol desempeña realmente </w:t>
+      </w:r>
+      <w:r>
+        <w:rPr>
+          <w:rFonts w:ascii="Times New Roman" w:hAnsi="Times New Roman" w:cs="Times New Roman"/>
+          <w:b/>
+          <w:bCs/>
+        </w:rPr>
+        <w:t xml:space="preserve">Model </w:t>
+      </w:r>
+      <w:proofErr w:type="spellStart"/>
+      <w:r>
+        <w:rPr>
+          <w:rFonts w:ascii="Times New Roman" w:hAnsi="Times New Roman" w:cs="Times New Roman"/>
+          <w:b/>
+          <w:bCs/>
+        </w:rPr>
+        <w:t>Context</w:t>
+      </w:r>
+      <w:proofErr w:type="spellEnd"/>
+      <w:r>
+        <w:rPr>
+          <w:rFonts w:ascii="Times New Roman" w:hAnsi="Times New Roman" w:cs="Times New Roman"/>
+          <w:b/>
+          <w:bCs/>
+        </w:rPr>
+        <w:t xml:space="preserve"> </w:t>
+      </w:r>
+      <w:proofErr w:type="spellStart"/>
+      <w:r>
+        <w:rPr>
+          <w:rFonts w:ascii="Times New Roman" w:hAnsi="Times New Roman" w:cs="Times New Roman"/>
+          <w:b/>
+          <w:bCs/>
+        </w:rPr>
+        <w:t>Protocol</w:t>
+      </w:r>
+      <w:proofErr w:type="spellEnd"/>
+      <w:r>
+        <w:rPr>
+          <w:rFonts w:ascii="Times New Roman" w:hAnsi="Times New Roman" w:cs="Times New Roman"/>
+          <w:b/>
+          <w:bCs/>
+        </w:rPr>
+        <w:t xml:space="preserve"> (MCP)</w:t>
+      </w:r>
+      <w:r>
+        <w:rPr>
+          <w:rFonts w:ascii="Times New Roman" w:hAnsi="Times New Roman" w:cs="Times New Roman"/>
+        </w:rPr>
+        <w:t xml:space="preserve"> dentro de los sistemas </w:t>
+      </w:r>
+      <w:r>
+        <w:rPr>
+          <w:rFonts w:ascii="Times New Roman" w:hAnsi="Times New Roman" w:cs="Times New Roman"/>
+        </w:rPr>
         <w:lastRenderedPageBreak/>
-        <w:t xml:space="preserve">Asimismo, persisten diferencias significativas en la forma en que las investigaciones evalúan la interoperabilidad, la coordinación entre agentes, la integración semántica, la trazabilidad, la latencia y la capacidad de automatización de las soluciones propuestas. Esta situación complica establecer con claridad qué arquitecturas son más utilizadas, qué rol desempeña realmente </w:t>
-      </w:r>
-      <w:r>
-        <w:rPr>
-          <w:rFonts w:ascii="Times New Roman" w:hAnsi="Times New Roman" w:cs="Times New Roman"/>
-          <w:b/>
-          <w:bCs/>
-        </w:rPr>
-        <w:t xml:space="preserve">Model </w:t>
-      </w:r>
-      <w:proofErr w:type="spellStart"/>
-      <w:r>
-        <w:rPr>
-          <w:rFonts w:ascii="Times New Roman" w:hAnsi="Times New Roman" w:cs="Times New Roman"/>
-          <w:b/>
-          <w:bCs/>
-        </w:rPr>
-        <w:t>Context</w:t>
-      </w:r>
-      <w:proofErr w:type="spellEnd"/>
-      <w:r>
-        <w:rPr>
-          <w:rFonts w:ascii="Times New Roman" w:hAnsi="Times New Roman" w:cs="Times New Roman"/>
-          <w:b/>
-          <w:bCs/>
-        </w:rPr>
-        <w:t xml:space="preserve"> </w:t>
-      </w:r>
-      <w:proofErr w:type="spellStart"/>
-      <w:r>
-        <w:rPr>
-          <w:rFonts w:ascii="Times New Roman" w:hAnsi="Times New Roman" w:cs="Times New Roman"/>
-          <w:b/>
-          <w:bCs/>
-        </w:rPr>
-        <w:t>Protocol</w:t>
-      </w:r>
-      <w:proofErr w:type="spellEnd"/>
-      <w:r>
-        <w:rPr>
-          <w:rFonts w:ascii="Times New Roman" w:hAnsi="Times New Roman" w:cs="Times New Roman"/>
-          <w:b/>
-          <w:bCs/>
-        </w:rPr>
-        <w:t xml:space="preserve"> (MCP)</w:t>
-      </w:r>
-      <w:r>
-        <w:rPr>
-          <w:rFonts w:ascii="Times New Roman" w:hAnsi="Times New Roman" w:cs="Times New Roman"/>
-        </w:rPr>
-        <w:t xml:space="preserve"> dentro de los sistemas multiagente, qué fuentes de datos industriales son integradas con mayor frecuencia y cuáles son los niveles de desempeño reportados en escenarios cercanos a la operación real [U2M5][13], [K4M7][5], [X5B9][7]. Del mismo modo, todavía existe variabilidad en el grado de madurez experimental de los estudios, ya que algunos se desarrollan sobre prototipos o entornos controlados, mientras que otros se orientan a aplicaciones más cercanas al entorno industrial, sin que exista una síntesis comparativa suficientemente consolidada [L6C2][12], [M6P3][6].</w:t>
+        <w:t xml:space="preserve">multiagente, qué fuentes de datos industriales son integradas con mayor frecuencia y cuáles son los niveles de desempeño reportados en escenarios cercanos a la operación real </w:t>
+      </w:r>
+      <w:r>
+        <w:rPr>
+          <w:rFonts w:ascii="Times New Roman" w:hAnsi="Times New Roman" w:cs="Times New Roman"/>
+        </w:rPr>
+        <w:t>[</w:t>
+      </w:r>
+      <w:r>
+        <w:rPr>
+          <w:rFonts w:ascii="Times New Roman" w:hAnsi="Times New Roman" w:cs="Times New Roman"/>
+        </w:rPr>
+        <w:t>13</w:t>
+      </w:r>
+      <w:r>
+        <w:rPr>
+          <w:rFonts w:ascii="Times New Roman" w:hAnsi="Times New Roman" w:cs="Times New Roman"/>
+        </w:rPr>
+        <w:t>]</w:t>
+      </w:r>
+      <w:r>
+        <w:rPr>
+          <w:rFonts w:ascii="Times New Roman" w:hAnsi="Times New Roman" w:cs="Times New Roman"/>
+        </w:rPr>
+        <w:t xml:space="preserve">, </w:t>
+      </w:r>
+      <w:r>
+        <w:rPr>
+          <w:rFonts w:ascii="Times New Roman" w:hAnsi="Times New Roman" w:cs="Times New Roman"/>
+        </w:rPr>
+        <w:t>[</w:t>
+      </w:r>
+      <w:r>
+        <w:rPr>
+          <w:rFonts w:ascii="Times New Roman" w:hAnsi="Times New Roman" w:cs="Times New Roman"/>
+        </w:rPr>
+        <w:t>5</w:t>
+      </w:r>
+      <w:r>
+        <w:rPr>
+          <w:rFonts w:ascii="Times New Roman" w:hAnsi="Times New Roman" w:cs="Times New Roman"/>
+        </w:rPr>
+        <w:t>]</w:t>
+      </w:r>
+      <w:r>
+        <w:rPr>
+          <w:rFonts w:ascii="Times New Roman" w:hAnsi="Times New Roman" w:cs="Times New Roman"/>
+        </w:rPr>
+        <w:t xml:space="preserve">, </w:t>
+      </w:r>
+      <w:r>
+        <w:rPr>
+          <w:rFonts w:ascii="Times New Roman" w:hAnsi="Times New Roman" w:cs="Times New Roman"/>
+        </w:rPr>
+        <w:t>[</w:t>
+      </w:r>
+      <w:r>
+        <w:rPr>
+          <w:rFonts w:ascii="Times New Roman" w:hAnsi="Times New Roman" w:cs="Times New Roman"/>
+        </w:rPr>
+        <w:t>7</w:t>
+      </w:r>
+      <w:r>
+        <w:rPr>
+          <w:rFonts w:ascii="Times New Roman" w:hAnsi="Times New Roman" w:cs="Times New Roman"/>
+        </w:rPr>
+        <w:t>]</w:t>
+      </w:r>
+      <w:r>
+        <w:rPr>
+          <w:rFonts w:ascii="Times New Roman" w:hAnsi="Times New Roman" w:cs="Times New Roman"/>
+        </w:rPr>
+        <w:t xml:space="preserve">. Del mismo modo, todavía existe variabilidad en el grado de madurez experimental de los estudios, ya que algunos se desarrollan sobre prototipos o entornos controlados, mientras que otros se orientan a aplicaciones más cercanas al entorno industrial, sin que exista una síntesis comparativa suficientemente consolidada </w:t>
+      </w:r>
+      <w:r>
+        <w:rPr>
+          <w:rFonts w:ascii="Times New Roman" w:hAnsi="Times New Roman" w:cs="Times New Roman"/>
+        </w:rPr>
+        <w:t>[</w:t>
+      </w:r>
+      <w:r>
+        <w:rPr>
+          <w:rFonts w:ascii="Times New Roman" w:hAnsi="Times New Roman" w:cs="Times New Roman"/>
+        </w:rPr>
+        <w:t>12</w:t>
+      </w:r>
+      <w:r>
+        <w:rPr>
+          <w:rFonts w:ascii="Times New Roman" w:hAnsi="Times New Roman" w:cs="Times New Roman"/>
+        </w:rPr>
+        <w:t>]</w:t>
+      </w:r>
+      <w:r>
+        <w:rPr>
+          <w:rFonts w:ascii="Times New Roman" w:hAnsi="Times New Roman" w:cs="Times New Roman"/>
+        </w:rPr>
+        <w:t xml:space="preserve">, </w:t>
+      </w:r>
+      <w:r>
+        <w:rPr>
+          <w:rFonts w:ascii="Times New Roman" w:hAnsi="Times New Roman" w:cs="Times New Roman"/>
+        </w:rPr>
+        <w:t>[</w:t>
+      </w:r>
+      <w:r>
+        <w:rPr>
+          <w:rFonts w:ascii="Times New Roman" w:hAnsi="Times New Roman" w:cs="Times New Roman"/>
+        </w:rPr>
+        <w:t>6</w:t>
+      </w:r>
+      <w:r>
+        <w:rPr>
+          <w:rFonts w:ascii="Times New Roman" w:hAnsi="Times New Roman" w:cs="Times New Roman"/>
+        </w:rPr>
+        <w:t>]</w:t>
+      </w:r>
+      <w:r>
+        <w:rPr>
+          <w:rFonts w:ascii="Times New Roman" w:hAnsi="Times New Roman" w:cs="Times New Roman"/>
+        </w:rPr>
+        <w:t>.</w:t>
       </w:r>
     </w:p>
     <w:p>
@@ -1337,7 +2830,55 @@
         <w:rPr>
           <w:rFonts w:ascii="Times New Roman" w:hAnsi="Times New Roman" w:cs="Times New Roman"/>
         </w:rPr>
-        <w:t>Adicionalmente, no se dispone de una síntesis estructurada y actualizada que integre de manera sistemática la evidencia relacionada específicamente con la convergencia entre arquitecturas multiagente basadas en inteligencia artificial, agentes LLM y MCP para la orquestación e integración de datos industriales. En consecuencia, existe la necesidad de consolidar el conocimiento disponible para proporcionar una visión integral del estado actual de la investigación, identificar vacíos conceptuales, metodológicos y aplicados, y delimitar oportunidades para futuros desarrollos científicos orientados a sistemas industriales más interoperables, automatizados y adaptativos [X7K2][2], [F6I1][14].</w:t>
+        <w:t xml:space="preserve">Adicionalmente, no se dispone de una síntesis estructurada y actualizada que integre de manera sistemática la evidencia relacionada específicamente con la convergencia entre arquitecturas multiagente basadas en inteligencia artificial, agentes LLM y MCP para la orquestación e integración de datos industriales. En consecuencia, existe la necesidad de consolidar el conocimiento disponible para proporcionar una visión integral del estado actual de la investigación, identificar vacíos conceptuales, metodológicos y aplicados, y delimitar oportunidades para futuros desarrollos científicos orientados a sistemas industriales más interoperables, automatizados y adaptativos </w:t>
+      </w:r>
+      <w:r>
+        <w:rPr>
+          <w:rFonts w:ascii="Times New Roman" w:hAnsi="Times New Roman" w:cs="Times New Roman"/>
+        </w:rPr>
+        <w:t>[</w:t>
+      </w:r>
+      <w:r>
+        <w:rPr>
+          <w:rFonts w:ascii="Times New Roman" w:hAnsi="Times New Roman" w:cs="Times New Roman"/>
+        </w:rPr>
+        <w:t>2</w:t>
+      </w:r>
+      <w:r>
+        <w:rPr>
+          <w:rFonts w:ascii="Times New Roman" w:hAnsi="Times New Roman" w:cs="Times New Roman"/>
+        </w:rPr>
+        <w:t>]</w:t>
+      </w:r>
+      <w:r>
+        <w:rPr>
+          <w:rFonts w:ascii="Times New Roman" w:hAnsi="Times New Roman" w:cs="Times New Roman"/>
+        </w:rPr>
+        <w:t xml:space="preserve">, </w:t>
+      </w:r>
+      <w:r>
+        <w:rPr>
+          <w:rFonts w:ascii="Times New Roman" w:hAnsi="Times New Roman" w:cs="Times New Roman"/>
+        </w:rPr>
+        <w:t>[</w:t>
+      </w:r>
+      <w:r>
+        <w:rPr>
+          <w:rFonts w:ascii="Times New Roman" w:hAnsi="Times New Roman" w:cs="Times New Roman"/>
+        </w:rPr>
+        <w:t>14</w:t>
+      </w:r>
+      <w:r>
+        <w:rPr>
+          <w:rFonts w:ascii="Times New Roman" w:hAnsi="Times New Roman" w:cs="Times New Roman"/>
+        </w:rPr>
+        <w:t>]</w:t>
+      </w:r>
+      <w:r>
+        <w:rPr>
+          <w:rFonts w:ascii="Times New Roman" w:hAnsi="Times New Roman" w:cs="Times New Roman"/>
+        </w:rPr>
+        <w:t>.</w:t>
       </w:r>
     </w:p>
     <w:p>
@@ -1377,7 +2918,55 @@
         <w:rPr>
           <w:rFonts w:ascii="Times New Roman" w:hAnsi="Times New Roman" w:cs="Times New Roman"/>
         </w:rPr>
-        <w:t xml:space="preserve">La creciente producción científica relacionada con arquitecturas multiagente, agentes basados en inteligencia artificial y protocolos de interoperabilidad aplicados a la industria ha generado un volumen considerable de evidencia distribuida en diferentes disciplinas, dominios de aplicación y contextos tecnológicos [Q9P1][1], [M6P3][6]. En este escenario, una revisión sistemática de la literatura constituye una metodología adecuada para identificar, seleccionar, evaluar y sintetizar de manera rigurosa la evidencia científica disponible sobre la orquestación e integración de datos industriales mediante arquitecturas multiagente y </w:t>
+        <w:t xml:space="preserve">La creciente producción científica relacionada con arquitecturas multiagente, agentes basados en inteligencia artificial y protocolos de interoperabilidad aplicados a la industria ha generado un volumen considerable de evidencia distribuida en diferentes disciplinas, dominios de aplicación y contextos tecnológicos </w:t>
+      </w:r>
+      <w:r>
+        <w:rPr>
+          <w:rFonts w:ascii="Times New Roman" w:hAnsi="Times New Roman" w:cs="Times New Roman"/>
+        </w:rPr>
+        <w:t>[</w:t>
+      </w:r>
+      <w:r>
+        <w:rPr>
+          <w:rFonts w:ascii="Times New Roman" w:hAnsi="Times New Roman" w:cs="Times New Roman"/>
+        </w:rPr>
+        <w:t>1</w:t>
+      </w:r>
+      <w:r>
+        <w:rPr>
+          <w:rFonts w:ascii="Times New Roman" w:hAnsi="Times New Roman" w:cs="Times New Roman"/>
+        </w:rPr>
+        <w:t>]</w:t>
+      </w:r>
+      <w:r>
+        <w:rPr>
+          <w:rFonts w:ascii="Times New Roman" w:hAnsi="Times New Roman" w:cs="Times New Roman"/>
+        </w:rPr>
+        <w:t xml:space="preserve">, </w:t>
+      </w:r>
+      <w:r>
+        <w:rPr>
+          <w:rFonts w:ascii="Times New Roman" w:hAnsi="Times New Roman" w:cs="Times New Roman"/>
+        </w:rPr>
+        <w:t>[</w:t>
+      </w:r>
+      <w:r>
+        <w:rPr>
+          <w:rFonts w:ascii="Times New Roman" w:hAnsi="Times New Roman" w:cs="Times New Roman"/>
+        </w:rPr>
+        <w:t>6</w:t>
+      </w:r>
+      <w:r>
+        <w:rPr>
+          <w:rFonts w:ascii="Times New Roman" w:hAnsi="Times New Roman" w:cs="Times New Roman"/>
+        </w:rPr>
+        <w:t>]</w:t>
+      </w:r>
+      <w:r>
+        <w:rPr>
+          <w:rFonts w:ascii="Times New Roman" w:hAnsi="Times New Roman" w:cs="Times New Roman"/>
+        </w:rPr>
+        <w:t xml:space="preserve">. En este escenario, una revisión sistemática de la literatura constituye una metodología adecuada para identificar, seleccionar, evaluar y sintetizar de manera rigurosa la evidencia científica disponible sobre la orquestación e integración de datos industriales mediante arquitecturas multiagente y </w:t>
       </w:r>
       <w:r>
         <w:rPr>
@@ -1441,7 +3030,79 @@
         <w:rPr>
           <w:rFonts w:ascii="Times New Roman" w:hAnsi="Times New Roman" w:cs="Times New Roman"/>
         </w:rPr>
-        <w:t>A diferencia de las revisiones narrativas tradicionales, este enfoque permite minimizar sesgos en la recopilación y análisis de la información, favoreciendo una comprensión más objetiva de los avances alcanzados, de las limitaciones existentes y de las tendencias metodológicas presentes en la literatura especializada [X7K2][2]. Además, resulta particularmente pertinente en un campo emergente como el de la convergencia entre agentes LLM, sistemas multiagente y MCP, donde la evidencia aún se encuentra dispersa en estudios con enfoques, métricas y niveles de madurez experimental muy diversos [K4M7][5], [L6C2][12].</w:t>
+        <w:t xml:space="preserve">A diferencia de las revisiones narrativas tradicionales, este enfoque permite minimizar sesgos en la recopilación y análisis de la información, favoreciendo una comprensión más objetiva de los avances alcanzados, de las limitaciones existentes y de las tendencias metodológicas presentes en la literatura especializada </w:t>
+      </w:r>
+      <w:r>
+        <w:rPr>
+          <w:rFonts w:ascii="Times New Roman" w:hAnsi="Times New Roman" w:cs="Times New Roman"/>
+        </w:rPr>
+        <w:t>[</w:t>
+      </w:r>
+      <w:r>
+        <w:rPr>
+          <w:rFonts w:ascii="Times New Roman" w:hAnsi="Times New Roman" w:cs="Times New Roman"/>
+        </w:rPr>
+        <w:t>2</w:t>
+      </w:r>
+      <w:r>
+        <w:rPr>
+          <w:rFonts w:ascii="Times New Roman" w:hAnsi="Times New Roman" w:cs="Times New Roman"/>
+        </w:rPr>
+        <w:t>]</w:t>
+      </w:r>
+      <w:r>
+        <w:rPr>
+          <w:rFonts w:ascii="Times New Roman" w:hAnsi="Times New Roman" w:cs="Times New Roman"/>
+        </w:rPr>
+        <w:t xml:space="preserve">. Además, resulta particularmente pertinente en un campo emergente como el de la convergencia entre agentes LLM, sistemas multiagente y MCP, donde la evidencia aún se encuentra dispersa en estudios con enfoques, métricas y niveles de madurez experimental muy diversos </w:t>
+      </w:r>
+      <w:r>
+        <w:rPr>
+          <w:rFonts w:ascii="Times New Roman" w:hAnsi="Times New Roman" w:cs="Times New Roman"/>
+        </w:rPr>
+        <w:t>[</w:t>
+      </w:r>
+      <w:r>
+        <w:rPr>
+          <w:rFonts w:ascii="Times New Roman" w:hAnsi="Times New Roman" w:cs="Times New Roman"/>
+        </w:rPr>
+        <w:t>5</w:t>
+      </w:r>
+      <w:r>
+        <w:rPr>
+          <w:rFonts w:ascii="Times New Roman" w:hAnsi="Times New Roman" w:cs="Times New Roman"/>
+        </w:rPr>
+        <w:t>]</w:t>
+      </w:r>
+      <w:r>
+        <w:rPr>
+          <w:rFonts w:ascii="Times New Roman" w:hAnsi="Times New Roman" w:cs="Times New Roman"/>
+        </w:rPr>
+        <w:t xml:space="preserve">, </w:t>
+      </w:r>
+      <w:r>
+        <w:rPr>
+          <w:rFonts w:ascii="Times New Roman" w:hAnsi="Times New Roman" w:cs="Times New Roman"/>
+        </w:rPr>
+        <w:t>[</w:t>
+      </w:r>
+      <w:r>
+        <w:rPr>
+          <w:rFonts w:ascii="Times New Roman" w:hAnsi="Times New Roman" w:cs="Times New Roman"/>
+        </w:rPr>
+        <w:t>12</w:t>
+      </w:r>
+      <w:r>
+        <w:rPr>
+          <w:rFonts w:ascii="Times New Roman" w:hAnsi="Times New Roman" w:cs="Times New Roman"/>
+        </w:rPr>
+        <w:t>]</w:t>
+      </w:r>
+      <w:r>
+        <w:rPr>
+          <w:rFonts w:ascii="Times New Roman" w:hAnsi="Times New Roman" w:cs="Times New Roman"/>
+        </w:rPr>
+        <w:t>.</w:t>
       </w:r>
     </w:p>
     <w:p>
@@ -1455,8 +3116,55 @@
         <w:rPr>
           <w:rFonts w:ascii="Times New Roman" w:hAnsi="Times New Roman" w:cs="Times New Roman"/>
         </w:rPr>
-        <w:lastRenderedPageBreak/>
-        <w:t>Asimismo, la presente revisión permitirá consolidar el conocimiento generado sobre la aplicación de estas arquitecturas a la integración y orquestación de datos industriales, identificando las propuestas más recurrentes, los entornos industriales más estudiados, las fuentes de datos empleadas, las métricas de evaluación reportadas y los principales resultados alcanzados. De esta manera, se busca proporcionar una síntesis estructurada que facilite la comparación entre enfoques existentes y contribuya a la identificación de tendencias, fortalezas, debilidades y oportunidades de investigación [U2M5][13], [X5B9][7].</w:t>
+        <w:t xml:space="preserve">Asimismo, la presente revisión permitirá consolidar el conocimiento generado sobre la aplicación de estas arquitecturas a la integración y orquestación de datos industriales, identificando las propuestas más recurrentes, los entornos industriales más estudiados, las fuentes de datos empleadas, las métricas de evaluación reportadas y los principales resultados alcanzados. De esta manera, se busca proporcionar una síntesis estructurada que facilite la comparación entre enfoques existentes y contribuya a la identificación de tendencias, fortalezas, debilidades y oportunidades de investigación </w:t>
+      </w:r>
+      <w:r>
+        <w:rPr>
+          <w:rFonts w:ascii="Times New Roman" w:hAnsi="Times New Roman" w:cs="Times New Roman"/>
+        </w:rPr>
+        <w:t>[</w:t>
+      </w:r>
+      <w:r>
+        <w:rPr>
+          <w:rFonts w:ascii="Times New Roman" w:hAnsi="Times New Roman" w:cs="Times New Roman"/>
+        </w:rPr>
+        <w:t>13</w:t>
+      </w:r>
+      <w:r>
+        <w:rPr>
+          <w:rFonts w:ascii="Times New Roman" w:hAnsi="Times New Roman" w:cs="Times New Roman"/>
+        </w:rPr>
+        <w:t>]</w:t>
+      </w:r>
+      <w:r>
+        <w:rPr>
+          <w:rFonts w:ascii="Times New Roman" w:hAnsi="Times New Roman" w:cs="Times New Roman"/>
+        </w:rPr>
+        <w:t xml:space="preserve">, </w:t>
+      </w:r>
+      <w:r>
+        <w:rPr>
+          <w:rFonts w:ascii="Times New Roman" w:hAnsi="Times New Roman" w:cs="Times New Roman"/>
+        </w:rPr>
+        <w:t>[</w:t>
+      </w:r>
+      <w:r>
+        <w:rPr>
+          <w:rFonts w:ascii="Times New Roman" w:hAnsi="Times New Roman" w:cs="Times New Roman"/>
+        </w:rPr>
+        <w:t>7</w:t>
+      </w:r>
+      <w:r>
+        <w:rPr>
+          <w:rFonts w:ascii="Times New Roman" w:hAnsi="Times New Roman" w:cs="Times New Roman"/>
+        </w:rPr>
+        <w:t>]</w:t>
+      </w:r>
+      <w:r>
+        <w:rPr>
+          <w:rFonts w:ascii="Times New Roman" w:hAnsi="Times New Roman" w:cs="Times New Roman"/>
+        </w:rPr>
+        <w:t>.</w:t>
       </w:r>
     </w:p>
     <w:p>
@@ -1470,7 +3178,56 @@
         <w:rPr>
           <w:rFonts w:ascii="Times New Roman" w:hAnsi="Times New Roman" w:cs="Times New Roman"/>
         </w:rPr>
-        <w:t>Desde una perspectiva práctica, los resultados de esta revisión podrán servir como referencia para investigadores, ingenieros y desarrolladores de soluciones industriales basadas en inteligencia artificial, proporcionando evidencia útil para orientar el diseño de futuras arquitecturas multiagente, estrategias de interoperabilidad y mecanismos de integración de datos más robustos, trazables y adaptativos en el contexto de la Industria 4.0 [F6I1][14], [C6Y4][3].</w:t>
+        <w:lastRenderedPageBreak/>
+        <w:t xml:space="preserve">Desde una perspectiva práctica, los resultados de esta revisión podrán servir como referencia para investigadores, ingenieros y desarrolladores de soluciones industriales basadas en inteligencia artificial, proporcionando evidencia útil para orientar el diseño de futuras arquitecturas multiagente, estrategias de interoperabilidad y mecanismos de integración de datos más robustos, trazables y adaptativos en el contexto de la Industria 4.0 </w:t>
+      </w:r>
+      <w:r>
+        <w:rPr>
+          <w:rFonts w:ascii="Times New Roman" w:hAnsi="Times New Roman" w:cs="Times New Roman"/>
+        </w:rPr>
+        <w:t>[</w:t>
+      </w:r>
+      <w:r>
+        <w:rPr>
+          <w:rFonts w:ascii="Times New Roman" w:hAnsi="Times New Roman" w:cs="Times New Roman"/>
+        </w:rPr>
+        <w:t>14</w:t>
+      </w:r>
+      <w:r>
+        <w:rPr>
+          <w:rFonts w:ascii="Times New Roman" w:hAnsi="Times New Roman" w:cs="Times New Roman"/>
+        </w:rPr>
+        <w:t>]</w:t>
+      </w:r>
+      <w:r>
+        <w:rPr>
+          <w:rFonts w:ascii="Times New Roman" w:hAnsi="Times New Roman" w:cs="Times New Roman"/>
+        </w:rPr>
+        <w:t xml:space="preserve">, </w:t>
+      </w:r>
+      <w:r>
+        <w:rPr>
+          <w:rFonts w:ascii="Times New Roman" w:hAnsi="Times New Roman" w:cs="Times New Roman"/>
+        </w:rPr>
+        <w:t>[</w:t>
+      </w:r>
+      <w:r>
+        <w:rPr>
+          <w:rFonts w:ascii="Times New Roman" w:hAnsi="Times New Roman" w:cs="Times New Roman"/>
+        </w:rPr>
+        <w:t>3</w:t>
+      </w:r>
+      <w:r>
+        <w:rPr>
+          <w:rFonts w:ascii="Times New Roman" w:hAnsi="Times New Roman" w:cs="Times New Roman"/>
+        </w:rPr>
+        <w:t>]</w:t>
+      </w:r>
+      <w:r>
+        <w:rPr>
+          <w:rFonts w:ascii="Times New Roman" w:hAnsi="Times New Roman" w:cs="Times New Roman"/>
+        </w:rPr>
+        <w:t>.</w:t>
       </w:r>
     </w:p>
     <w:p>
@@ -1720,7 +3477,6 @@
           <w:b/>
           <w:bCs/>
         </w:rPr>
-        <w:lastRenderedPageBreak/>
         <w:t>RQ4.</w:t>
       </w:r>
       <w:r>
@@ -1785,6 +3541,7 @@
         <w:rPr>
           <w:rFonts w:ascii="Times New Roman" w:hAnsi="Times New Roman" w:cs="Times New Roman"/>
         </w:rPr>
+        <w:lastRenderedPageBreak/>
         <w:t xml:space="preserve">Con el fin de responder estas preguntas, la presente investigación adopta la metodología </w:t>
       </w:r>
       <w:r>
@@ -2484,7 +4241,6 @@
           <w:b/>
           <w:bCs/>
         </w:rPr>
-        <w:lastRenderedPageBreak/>
         <w:t>Escala de valoración por criterio</w:t>
       </w:r>
     </w:p>
@@ -3179,7 +4935,55 @@
         <w:rPr>
           <w:rFonts w:ascii="Times New Roman" w:hAnsi="Times New Roman" w:cs="Times New Roman"/>
         </w:rPr>
-        <w:t>La selección de estas bases de datos respondió a tres criterios fundamentales. En primer lugar, ambas ofrecen una cobertura amplia y complementaria de revistas científicas y actas de congresos de alto impacto, reduciendo el riesgo de omitir estudios relevantes. En segundo lugar, disponen de herramientas avanzadas de búsqueda que permiten combinar operadores booleanos, filtros por campos específicos y estrategias de refinamiento, facilitando la construcción de búsquedas precisas, exhaustivas y reproducibles. Finalmente, ambas plataformas permiten exportar la información bibliográfica en formatos estandarizados compatibles con herramientas especializadas para la gestión de revisiones sistemáticas [P8S2][16], [K7H4][17].</w:t>
+        <w:t xml:space="preserve">La selección de estas bases de datos respondió a tres criterios fundamentales. En primer lugar, ambas ofrecen una cobertura amplia y complementaria de revistas científicas y actas de congresos de alto impacto, reduciendo el riesgo de omitir estudios relevantes. En segundo lugar, disponen de herramientas avanzadas de búsqueda que permiten combinar operadores booleanos, filtros por campos específicos y estrategias de refinamiento, facilitando la construcción de búsquedas precisas, exhaustivas y reproducibles. Finalmente, ambas plataformas permiten exportar la información bibliográfica en formatos estandarizados compatibles con herramientas especializadas para la gestión de revisiones sistemáticas </w:t>
+      </w:r>
+      <w:r>
+        <w:rPr>
+          <w:rFonts w:ascii="Times New Roman" w:hAnsi="Times New Roman" w:cs="Times New Roman"/>
+        </w:rPr>
+        <w:t>[</w:t>
+      </w:r>
+      <w:r>
+        <w:rPr>
+          <w:rFonts w:ascii="Times New Roman" w:hAnsi="Times New Roman" w:cs="Times New Roman"/>
+        </w:rPr>
+        <w:t>16</w:t>
+      </w:r>
+      <w:r>
+        <w:rPr>
+          <w:rFonts w:ascii="Times New Roman" w:hAnsi="Times New Roman" w:cs="Times New Roman"/>
+        </w:rPr>
+        <w:t>]</w:t>
+      </w:r>
+      <w:r>
+        <w:rPr>
+          <w:rFonts w:ascii="Times New Roman" w:hAnsi="Times New Roman" w:cs="Times New Roman"/>
+        </w:rPr>
+        <w:t xml:space="preserve">, </w:t>
+      </w:r>
+      <w:r>
+        <w:rPr>
+          <w:rFonts w:ascii="Times New Roman" w:hAnsi="Times New Roman" w:cs="Times New Roman"/>
+        </w:rPr>
+        <w:t>[</w:t>
+      </w:r>
+      <w:r>
+        <w:rPr>
+          <w:rFonts w:ascii="Times New Roman" w:hAnsi="Times New Roman" w:cs="Times New Roman"/>
+        </w:rPr>
+        <w:t>17</w:t>
+      </w:r>
+      <w:r>
+        <w:rPr>
+          <w:rFonts w:ascii="Times New Roman" w:hAnsi="Times New Roman" w:cs="Times New Roman"/>
+        </w:rPr>
+        <w:t>]</w:t>
+      </w:r>
+      <w:r>
+        <w:rPr>
+          <w:rFonts w:ascii="Times New Roman" w:hAnsi="Times New Roman" w:cs="Times New Roman"/>
+        </w:rPr>
+        <w:t>.</w:t>
       </w:r>
     </w:p>
     <w:p>
@@ -3193,7 +4997,6 @@
         <w:rPr>
           <w:rFonts w:ascii="Times New Roman" w:hAnsi="Times New Roman" w:cs="Times New Roman"/>
         </w:rPr>
-        <w:lastRenderedPageBreak/>
         <w:t xml:space="preserve">La </w:t>
       </w:r>
       <w:r>
@@ -3379,46 +5182,62 @@
               <w:rPr>
                 <w:rFonts w:ascii="Times New Roman" w:hAnsi="Times New Roman" w:cs="Times New Roman"/>
               </w:rPr>
-              <w:t>Ciencias de la Computación, Inteligencia Artificial, Ingeniería, Automatización, Sistemas de Información e Industria 4.0</w:t>
-            </w:r>
-          </w:p>
-        </w:tc>
-        <w:tc>
-          <w:tcPr>
-            <w:tcW w:w="0" w:type="auto"/>
-            <w:hideMark/>
-          </w:tcPr>
-          <w:p>
-            <w:pPr>
-              <w:spacing w:after="160" w:line="278" w:lineRule="auto"/>
-              <w:rPr>
-                <w:rFonts w:ascii="Times New Roman" w:hAnsi="Times New Roman" w:cs="Times New Roman"/>
-              </w:rPr>
-            </w:pPr>
-            <w:r>
-              <w:rPr>
-                <w:rFonts w:ascii="Times New Roman" w:hAnsi="Times New Roman" w:cs="Times New Roman"/>
-              </w:rPr>
-              <w:t>TITLE-ABS-KEY (título, resumen y palabras clave)</w:t>
-            </w:r>
-          </w:p>
-        </w:tc>
-        <w:tc>
-          <w:tcPr>
-            <w:tcW w:w="0" w:type="auto"/>
-            <w:hideMark/>
-          </w:tcPr>
-          <w:p>
-            <w:pPr>
-              <w:spacing w:after="160" w:line="278" w:lineRule="auto"/>
-              <w:rPr>
-                <w:rFonts w:ascii="Times New Roman" w:hAnsi="Times New Roman" w:cs="Times New Roman"/>
-              </w:rPr>
-            </w:pPr>
-            <w:r>
-              <w:rPr>
-                <w:rFonts w:ascii="Times New Roman" w:hAnsi="Times New Roman" w:cs="Times New Roman"/>
-              </w:rPr>
+              <w:t xml:space="preserve">Ciencias de la Computación, Inteligencia Artificial, </w:t>
+            </w:r>
+            <w:r>
+              <w:rPr>
+                <w:rFonts w:ascii="Times New Roman" w:hAnsi="Times New Roman" w:cs="Times New Roman"/>
+              </w:rPr>
+              <w:lastRenderedPageBreak/>
+              <w:t>Ingeniería, Automatización, Sistemas de Información e Industria 4.0</w:t>
+            </w:r>
+          </w:p>
+        </w:tc>
+        <w:tc>
+          <w:tcPr>
+            <w:tcW w:w="0" w:type="auto"/>
+            <w:hideMark/>
+          </w:tcPr>
+          <w:p>
+            <w:pPr>
+              <w:spacing w:after="160" w:line="278" w:lineRule="auto"/>
+              <w:rPr>
+                <w:rFonts w:ascii="Times New Roman" w:hAnsi="Times New Roman" w:cs="Times New Roman"/>
+              </w:rPr>
+            </w:pPr>
+            <w:r>
+              <w:rPr>
+                <w:rFonts w:ascii="Times New Roman" w:hAnsi="Times New Roman" w:cs="Times New Roman"/>
+              </w:rPr>
+              <w:lastRenderedPageBreak/>
+              <w:t xml:space="preserve">TITLE-ABS-KEY (título, </w:t>
+            </w:r>
+            <w:r>
+              <w:rPr>
+                <w:rFonts w:ascii="Times New Roman" w:hAnsi="Times New Roman" w:cs="Times New Roman"/>
+              </w:rPr>
+              <w:lastRenderedPageBreak/>
+              <w:t>resumen y palabras clave)</w:t>
+            </w:r>
+          </w:p>
+        </w:tc>
+        <w:tc>
+          <w:tcPr>
+            <w:tcW w:w="0" w:type="auto"/>
+            <w:hideMark/>
+          </w:tcPr>
+          <w:p>
+            <w:pPr>
+              <w:spacing w:after="160" w:line="278" w:lineRule="auto"/>
+              <w:rPr>
+                <w:rFonts w:ascii="Times New Roman" w:hAnsi="Times New Roman" w:cs="Times New Roman"/>
+              </w:rPr>
+            </w:pPr>
+            <w:r>
+              <w:rPr>
+                <w:rFonts w:ascii="Times New Roman" w:hAnsi="Times New Roman" w:cs="Times New Roman"/>
+              </w:rPr>
+              <w:lastRenderedPageBreak/>
               <w:t>RIS, CSV</w:t>
             </w:r>
           </w:p>
@@ -3592,7 +5411,31 @@
         <w:rPr>
           <w:rFonts w:ascii="Times New Roman" w:hAnsi="Times New Roman" w:cs="Times New Roman"/>
         </w:rPr>
-        <w:t xml:space="preserve">, plataforma especializada para la gestión de revisiones sistemáticas, con el fin de centralizar la información recuperada, identificar y eliminar registros duplicados, documentar las decisiones adoptadas durante el proceso de selección y mantener la trazabilidad completa de cada estudio desde su identificación inicial hasta su inclusión definitiva [P2A6][18]. Para el análisis descriptivo y la visualización exploratoria de tendencias bibliográficas se contempló el uso complementario de </w:t>
+        <w:t xml:space="preserve">, plataforma especializada para la gestión de revisiones sistemáticas, con el fin de centralizar la información recuperada, identificar y eliminar registros duplicados, documentar las decisiones adoptadas durante el proceso de selección y mantener la trazabilidad completa de cada estudio desde su identificación inicial hasta su inclusión definitiva </w:t>
+      </w:r>
+      <w:r>
+        <w:rPr>
+          <w:rFonts w:ascii="Times New Roman" w:hAnsi="Times New Roman" w:cs="Times New Roman"/>
+        </w:rPr>
+        <w:t>[</w:t>
+      </w:r>
+      <w:r>
+        <w:rPr>
+          <w:rFonts w:ascii="Times New Roman" w:hAnsi="Times New Roman" w:cs="Times New Roman"/>
+        </w:rPr>
+        <w:t>18</w:t>
+      </w:r>
+      <w:r>
+        <w:rPr>
+          <w:rFonts w:ascii="Times New Roman" w:hAnsi="Times New Roman" w:cs="Times New Roman"/>
+        </w:rPr>
+        <w:t>]</w:t>
+      </w:r>
+      <w:r>
+        <w:rPr>
+          <w:rFonts w:ascii="Times New Roman" w:hAnsi="Times New Roman" w:cs="Times New Roman"/>
+        </w:rPr>
+        <w:t xml:space="preserve">. Para el análisis descriptivo y la visualización exploratoria de tendencias bibliográficas se contempló el uso complementario de </w:t>
       </w:r>
       <w:proofErr w:type="spellStart"/>
       <w:r>
@@ -3608,7 +5451,31 @@
         <w:rPr>
           <w:rFonts w:ascii="Times New Roman" w:hAnsi="Times New Roman" w:cs="Times New Roman"/>
         </w:rPr>
-        <w:t>, software orientado a la construcción y representación de redes bibliométricas [V9S4][19].</w:t>
+        <w:t xml:space="preserve">, software orientado a la construcción y representación de redes bibliométricas </w:t>
+      </w:r>
+      <w:r>
+        <w:rPr>
+          <w:rFonts w:ascii="Times New Roman" w:hAnsi="Times New Roman" w:cs="Times New Roman"/>
+        </w:rPr>
+        <w:t>[</w:t>
+      </w:r>
+      <w:r>
+        <w:rPr>
+          <w:rFonts w:ascii="Times New Roman" w:hAnsi="Times New Roman" w:cs="Times New Roman"/>
+        </w:rPr>
+        <w:t>19</w:t>
+      </w:r>
+      <w:r>
+        <w:rPr>
+          <w:rFonts w:ascii="Times New Roman" w:hAnsi="Times New Roman" w:cs="Times New Roman"/>
+        </w:rPr>
+        <w:t>]</w:t>
+      </w:r>
+      <w:r>
+        <w:rPr>
+          <w:rFonts w:ascii="Times New Roman" w:hAnsi="Times New Roman" w:cs="Times New Roman"/>
+        </w:rPr>
+        <w:t>.</w:t>
       </w:r>
     </w:p>
     <w:p>
@@ -3636,14 +5503,7 @@
         <w:rPr>
           <w:rFonts w:ascii="Times New Roman" w:hAnsi="Times New Roman" w:cs="Times New Roman"/>
         </w:rPr>
-        <w:t xml:space="preserve"> y de las preguntas de investigación, se establecieron los términos de </w:t>
-      </w:r>
-      <w:r>
-        <w:rPr>
-          <w:rFonts w:ascii="Times New Roman" w:hAnsi="Times New Roman" w:cs="Times New Roman"/>
-        </w:rPr>
-        <w:lastRenderedPageBreak/>
-        <w:t>búsqueda y sus sinónimos, y posteriormente se construyeron las cadenas de búsqueda específicas para cada base de datos, tal como se describe en la siguiente subsección.</w:t>
+        <w:t xml:space="preserve"> y de las preguntas de investigación, se establecieron los términos de búsqueda y sus sinónimos, y posteriormente se construyeron las cadenas de búsqueda específicas para cada base de datos, tal como se describe en la siguiente subsección.</w:t>
       </w:r>
     </w:p>
     <w:p>
@@ -3689,7 +5549,31 @@
         <w:rPr>
           <w:rFonts w:ascii="Times New Roman" w:hAnsi="Times New Roman" w:cs="Times New Roman"/>
         </w:rPr>
-        <w:t>, metodología ampliamente utilizada en revisiones sistemáticas de Ciencias de la Computación para verificar la capacidad de una cadena de búsqueda de recuperar los estudios más representativos del dominio de investigación [K7H4][17].</w:t>
+        <w:t xml:space="preserve">, metodología ampliamente utilizada en revisiones sistemáticas de Ciencias de la Computación para verificar la capacidad de una cadena de búsqueda de recuperar los estudios más representativos del dominio de investigación </w:t>
+      </w:r>
+      <w:r>
+        <w:rPr>
+          <w:rFonts w:ascii="Times New Roman" w:hAnsi="Times New Roman" w:cs="Times New Roman"/>
+        </w:rPr>
+        <w:t>[</w:t>
+      </w:r>
+      <w:r>
+        <w:rPr>
+          <w:rFonts w:ascii="Times New Roman" w:hAnsi="Times New Roman" w:cs="Times New Roman"/>
+        </w:rPr>
+        <w:t>17</w:t>
+      </w:r>
+      <w:r>
+        <w:rPr>
+          <w:rFonts w:ascii="Times New Roman" w:hAnsi="Times New Roman" w:cs="Times New Roman"/>
+        </w:rPr>
+        <w:t>]</w:t>
+      </w:r>
+      <w:r>
+        <w:rPr>
+          <w:rFonts w:ascii="Times New Roman" w:hAnsi="Times New Roman" w:cs="Times New Roman"/>
+        </w:rPr>
+        <w:t>.</w:t>
       </w:r>
     </w:p>
     <w:p>
@@ -3703,6 +5587,7 @@
         <w:rPr>
           <w:rFonts w:ascii="Times New Roman" w:hAnsi="Times New Roman" w:cs="Times New Roman"/>
         </w:rPr>
+        <w:lastRenderedPageBreak/>
         <w:t xml:space="preserve">El </w:t>
       </w:r>
       <w:r>
@@ -4169,7 +6054,6 @@
               <w:rPr>
                 <w:rFonts w:ascii="Times New Roman" w:hAnsi="Times New Roman" w:cs="Times New Roman"/>
               </w:rPr>
-              <w:lastRenderedPageBreak/>
               <w:t>GS01</w:t>
             </w:r>
           </w:p>
@@ -4502,7 +6386,17 @@
                 <w:iCs/>
                 <w:lang w:val="en-US"/>
               </w:rPr>
-              <w:t>Beyond Formal Semantics for Capabilities and Skills: Model Context Protocol in Manufacturing</w:t>
+              <w:t xml:space="preserve">Beyond Formal Semantics for Capabilities and Skills: Model </w:t>
+            </w:r>
+            <w:r>
+              <w:rPr>
+                <w:rFonts w:ascii="Times New Roman" w:hAnsi="Times New Roman" w:cs="Times New Roman"/>
+                <w:i/>
+                <w:iCs/>
+                <w:lang w:val="en-US"/>
+              </w:rPr>
+              <w:lastRenderedPageBreak/>
+              <w:t>Context Protocol in Manufacturing</w:t>
             </w:r>
           </w:p>
         </w:tc>
@@ -4523,6 +6417,7 @@
               <w:rPr>
                 <w:rFonts w:ascii="Times New Roman" w:hAnsi="Times New Roman" w:cs="Times New Roman"/>
               </w:rPr>
+              <w:lastRenderedPageBreak/>
               <w:t>Scopus</w:t>
             </w:r>
             <w:proofErr w:type="spellEnd"/>
@@ -5546,7 +7441,6 @@
         <w:rPr>
           <w:rFonts w:ascii="Times New Roman" w:hAnsi="Times New Roman" w:cs="Times New Roman"/>
         </w:rPr>
-        <w:lastRenderedPageBreak/>
         <w:t xml:space="preserve">El refinamiento de la estrategia fue documentado de manera sistemática para garantizar la trazabilidad de las modificaciones realizadas durante el proceso de validación. La </w:t>
       </w:r>
       <w:r>
@@ -5733,6 +7627,7 @@
               <w:rPr>
                 <w:rFonts w:ascii="Times New Roman" w:hAnsi="Times New Roman" w:cs="Times New Roman"/>
               </w:rPr>
+              <w:lastRenderedPageBreak/>
               <w:t>V1</w:t>
             </w:r>
           </w:p>
@@ -6345,7 +8240,55 @@
         <w:rPr>
           <w:rFonts w:ascii="Times New Roman" w:hAnsi="Times New Roman" w:cs="Times New Roman"/>
         </w:rPr>
-        <w:t xml:space="preserve"> [P2A6][18], [P8S2][16].</w:t>
+        <w:t xml:space="preserve"> </w:t>
+      </w:r>
+      <w:r>
+        <w:rPr>
+          <w:rFonts w:ascii="Times New Roman" w:hAnsi="Times New Roman" w:cs="Times New Roman"/>
+        </w:rPr>
+        <w:t>[</w:t>
+      </w:r>
+      <w:r>
+        <w:rPr>
+          <w:rFonts w:ascii="Times New Roman" w:hAnsi="Times New Roman" w:cs="Times New Roman"/>
+        </w:rPr>
+        <w:t>18</w:t>
+      </w:r>
+      <w:r>
+        <w:rPr>
+          <w:rFonts w:ascii="Times New Roman" w:hAnsi="Times New Roman" w:cs="Times New Roman"/>
+        </w:rPr>
+        <w:t>]</w:t>
+      </w:r>
+      <w:r>
+        <w:rPr>
+          <w:rFonts w:ascii="Times New Roman" w:hAnsi="Times New Roman" w:cs="Times New Roman"/>
+        </w:rPr>
+        <w:t xml:space="preserve">, </w:t>
+      </w:r>
+      <w:r>
+        <w:rPr>
+          <w:rFonts w:ascii="Times New Roman" w:hAnsi="Times New Roman" w:cs="Times New Roman"/>
+        </w:rPr>
+        <w:t>[</w:t>
+      </w:r>
+      <w:r>
+        <w:rPr>
+          <w:rFonts w:ascii="Times New Roman" w:hAnsi="Times New Roman" w:cs="Times New Roman"/>
+        </w:rPr>
+        <w:t>16</w:t>
+      </w:r>
+      <w:r>
+        <w:rPr>
+          <w:rFonts w:ascii="Times New Roman" w:hAnsi="Times New Roman" w:cs="Times New Roman"/>
+        </w:rPr>
+        <w:t>]</w:t>
+      </w:r>
+      <w:r>
+        <w:rPr>
+          <w:rFonts w:ascii="Times New Roman" w:hAnsi="Times New Roman" w:cs="Times New Roman"/>
+        </w:rPr>
+        <w:t>.</w:t>
       </w:r>
     </w:p>
     <w:p>
@@ -6394,7 +8337,28 @@
           <w:rFonts w:ascii="Times New Roman" w:hAnsi="Times New Roman" w:cs="Times New Roman"/>
           <w:lang w:val="en-US"/>
         </w:rPr>
-        <w:t xml:space="preserve">[Q9P1][1] H. Eichelberger, C. Sauer, A. S. Ahmadian y C. </w:t>
+        <w:t>[</w:t>
+      </w:r>
+      <w:r>
+        <w:rPr>
+          <w:rFonts w:ascii="Times New Roman" w:hAnsi="Times New Roman" w:cs="Times New Roman"/>
+          <w:lang w:val="en-US"/>
+        </w:rPr>
+        <w:t>1</w:t>
+      </w:r>
+      <w:r>
+        <w:rPr>
+          <w:rFonts w:ascii="Times New Roman" w:hAnsi="Times New Roman" w:cs="Times New Roman"/>
+          <w:lang w:val="en-US"/>
+        </w:rPr>
+        <w:t>]</w:t>
+      </w:r>
+      <w:r>
+        <w:rPr>
+          <w:rFonts w:ascii="Times New Roman" w:hAnsi="Times New Roman" w:cs="Times New Roman"/>
+          <w:lang w:val="en-US"/>
+        </w:rPr>
+        <w:t xml:space="preserve"> H. Eichelberger, C. Sauer, A. S. Ahmadian y C. </w:t>
       </w:r>
       <w:proofErr w:type="spellStart"/>
       <w:r>
@@ -6484,7 +8448,28 @@
           <w:rFonts w:ascii="Times New Roman" w:hAnsi="Times New Roman" w:cs="Times New Roman"/>
           <w:lang w:val="en-US"/>
         </w:rPr>
-        <w:t xml:space="preserve">[X7K2][2] G. Hildebrandt, D. Dittler, P. Habiger, R. Drath y M. Weyrich, “Data Integration for Digital Twins in Industrial Automation: A Systematic Literature Review,” </w:t>
+        <w:t>[</w:t>
+      </w:r>
+      <w:r>
+        <w:rPr>
+          <w:rFonts w:ascii="Times New Roman" w:hAnsi="Times New Roman" w:cs="Times New Roman"/>
+          <w:lang w:val="en-US"/>
+        </w:rPr>
+        <w:t>2</w:t>
+      </w:r>
+      <w:r>
+        <w:rPr>
+          <w:rFonts w:ascii="Times New Roman" w:hAnsi="Times New Roman" w:cs="Times New Roman"/>
+          <w:lang w:val="en-US"/>
+        </w:rPr>
+        <w:t>]</w:t>
+      </w:r>
+      <w:r>
+        <w:rPr>
+          <w:rFonts w:ascii="Times New Roman" w:hAnsi="Times New Roman" w:cs="Times New Roman"/>
+          <w:lang w:val="en-US"/>
+        </w:rPr>
+        <w:t xml:space="preserve"> G. Hildebrandt, D. Dittler, P. Habiger, R. Drath y M. Weyrich, “Data Integration for Digital Twins in Industrial Automation: A Systematic Literature Review,” </w:t>
       </w:r>
       <w:r>
         <w:rPr>
@@ -6541,7 +8526,28 @@
           <w:rFonts w:ascii="Times New Roman" w:hAnsi="Times New Roman" w:cs="Times New Roman"/>
           <w:lang w:val="en-US"/>
         </w:rPr>
-        <w:t xml:space="preserve">[C6Y4][3] S.-L. Jean Pierre, R. L. Castro Vergara y L. Valladares Hellen, “Effects of the use of digital technologies on the performance of firms in a developing country: are there differences between creative and manufacturing </w:t>
+        <w:t>[</w:t>
+      </w:r>
+      <w:r>
+        <w:rPr>
+          <w:rFonts w:ascii="Times New Roman" w:hAnsi="Times New Roman" w:cs="Times New Roman"/>
+          <w:lang w:val="en-US"/>
+        </w:rPr>
+        <w:t>3</w:t>
+      </w:r>
+      <w:r>
+        <w:rPr>
+          <w:rFonts w:ascii="Times New Roman" w:hAnsi="Times New Roman" w:cs="Times New Roman"/>
+          <w:lang w:val="en-US"/>
+        </w:rPr>
+        <w:t>]</w:t>
+      </w:r>
+      <w:r>
+        <w:rPr>
+          <w:rFonts w:ascii="Times New Roman" w:hAnsi="Times New Roman" w:cs="Times New Roman"/>
+          <w:lang w:val="en-US"/>
+        </w:rPr>
+        <w:t xml:space="preserve"> S.-L. Jean Pierre, R. L. Castro Vergara y L. Valladares Hellen, “Effects of the use of digital technologies on the performance of firms in a developing country: are there differences between creative and manufacturing </w:t>
       </w:r>
       <w:proofErr w:type="gramStart"/>
       <w:r>
@@ -6604,7 +8610,28 @@
           <w:rFonts w:ascii="Times New Roman" w:hAnsi="Times New Roman" w:cs="Times New Roman"/>
           <w:lang w:val="en-US"/>
         </w:rPr>
-        <w:t xml:space="preserve">[N7D2][4] D. Maldonado, E. Cruz, J. Abad Torres, P. J. Cruz y S. del P. Gamboa Benitez, “Multi-Agent Systems: A Survey About Its Components, Framework and Workflow,” </w:t>
+        <w:t>[</w:t>
+      </w:r>
+      <w:r>
+        <w:rPr>
+          <w:rFonts w:ascii="Times New Roman" w:hAnsi="Times New Roman" w:cs="Times New Roman"/>
+          <w:lang w:val="en-US"/>
+        </w:rPr>
+        <w:t>4</w:t>
+      </w:r>
+      <w:r>
+        <w:rPr>
+          <w:rFonts w:ascii="Times New Roman" w:hAnsi="Times New Roman" w:cs="Times New Roman"/>
+          <w:lang w:val="en-US"/>
+        </w:rPr>
+        <w:t>]</w:t>
+      </w:r>
+      <w:r>
+        <w:rPr>
+          <w:rFonts w:ascii="Times New Roman" w:hAnsi="Times New Roman" w:cs="Times New Roman"/>
+          <w:lang w:val="en-US"/>
+        </w:rPr>
+        <w:t xml:space="preserve"> D. Maldonado, E. Cruz, J. Abad Torres, P. J. Cruz y S. del P. Gamboa Benitez, “Multi-Agent Systems: A Survey About Its Components, Framework and Workflow,” </w:t>
       </w:r>
       <w:r>
         <w:rPr>
@@ -6652,7 +8679,28 @@
           <w:rFonts w:ascii="Times New Roman" w:hAnsi="Times New Roman" w:cs="Times New Roman"/>
           <w:lang w:val="en-US"/>
         </w:rPr>
-        <w:t xml:space="preserve">[K4M7][5] Y. Xia, N. </w:t>
+        <w:t>[</w:t>
+      </w:r>
+      <w:r>
+        <w:rPr>
+          <w:rFonts w:ascii="Times New Roman" w:hAnsi="Times New Roman" w:cs="Times New Roman"/>
+          <w:lang w:val="en-US"/>
+        </w:rPr>
+        <w:t>5</w:t>
+      </w:r>
+      <w:r>
+        <w:rPr>
+          <w:rFonts w:ascii="Times New Roman" w:hAnsi="Times New Roman" w:cs="Times New Roman"/>
+          <w:lang w:val="en-US"/>
+        </w:rPr>
+        <w:t>]</w:t>
+      </w:r>
+      <w:r>
+        <w:rPr>
+          <w:rFonts w:ascii="Times New Roman" w:hAnsi="Times New Roman" w:cs="Times New Roman"/>
+          <w:lang w:val="en-US"/>
+        </w:rPr>
+        <w:t xml:space="preserve"> Y. Xia, N. </w:t>
       </w:r>
       <w:proofErr w:type="spellStart"/>
       <w:r>
@@ -6726,7 +8774,28 @@
           <w:rFonts w:ascii="Times New Roman" w:hAnsi="Times New Roman" w:cs="Times New Roman"/>
           <w:lang w:val="en-US"/>
         </w:rPr>
-        <w:t xml:space="preserve">[M6P3][6] N. Krishnan, “Advancing Multi-Agent Systems Through Model Context Protocol: Architecture, Implementation, and Applications,” arXiv:2504.21030, 2025. Disponible </w:t>
+        <w:t>[</w:t>
+      </w:r>
+      <w:r>
+        <w:rPr>
+          <w:rFonts w:ascii="Times New Roman" w:hAnsi="Times New Roman" w:cs="Times New Roman"/>
+          <w:lang w:val="en-US"/>
+        </w:rPr>
+        <w:t>6</w:t>
+      </w:r>
+      <w:r>
+        <w:rPr>
+          <w:rFonts w:ascii="Times New Roman" w:hAnsi="Times New Roman" w:cs="Times New Roman"/>
+          <w:lang w:val="en-US"/>
+        </w:rPr>
+        <w:t>]</w:t>
+      </w:r>
+      <w:r>
+        <w:rPr>
+          <w:rFonts w:ascii="Times New Roman" w:hAnsi="Times New Roman" w:cs="Times New Roman"/>
+          <w:lang w:val="en-US"/>
+        </w:rPr>
+        <w:t xml:space="preserve"> N. Krishnan, “Advancing Multi-Agent Systems Through Model Context Protocol: Architecture, Implementation, and Applications,” arXiv:2504.21030, 2025. Disponible </w:t>
       </w:r>
       <w:proofErr w:type="spellStart"/>
       <w:r>
@@ -6768,7 +8837,28 @@
           <w:rFonts w:ascii="Times New Roman" w:hAnsi="Times New Roman" w:cs="Times New Roman"/>
           <w:lang w:val="en-US"/>
         </w:rPr>
-        <w:t xml:space="preserve">[X5B9][7] L. M. V. da Silva, A. </w:t>
+        <w:t>[</w:t>
+      </w:r>
+      <w:r>
+        <w:rPr>
+          <w:rFonts w:ascii="Times New Roman" w:hAnsi="Times New Roman" w:cs="Times New Roman"/>
+          <w:lang w:val="en-US"/>
+        </w:rPr>
+        <w:t>7</w:t>
+      </w:r>
+      <w:r>
+        <w:rPr>
+          <w:rFonts w:ascii="Times New Roman" w:hAnsi="Times New Roman" w:cs="Times New Roman"/>
+          <w:lang w:val="en-US"/>
+        </w:rPr>
+        <w:t>]</w:t>
+      </w:r>
+      <w:r>
+        <w:rPr>
+          <w:rFonts w:ascii="Times New Roman" w:hAnsi="Times New Roman" w:cs="Times New Roman"/>
+          <w:lang w:val="en-US"/>
+        </w:rPr>
+        <w:t xml:space="preserve"> L. M. V. da Silva, A. </w:t>
       </w:r>
       <w:proofErr w:type="spellStart"/>
       <w:r>
@@ -6826,7 +8916,28 @@
           <w:rFonts w:ascii="Times New Roman" w:hAnsi="Times New Roman" w:cs="Times New Roman"/>
           <w:lang w:val="en-US"/>
         </w:rPr>
-        <w:t xml:space="preserve">[T5W9][8] C. Morariu y T. </w:t>
+        <w:t>[</w:t>
+      </w:r>
+      <w:r>
+        <w:rPr>
+          <w:rFonts w:ascii="Times New Roman" w:hAnsi="Times New Roman" w:cs="Times New Roman"/>
+          <w:lang w:val="en-US"/>
+        </w:rPr>
+        <w:t>8</w:t>
+      </w:r>
+      <w:r>
+        <w:rPr>
+          <w:rFonts w:ascii="Times New Roman" w:hAnsi="Times New Roman" w:cs="Times New Roman"/>
+          <w:lang w:val="en-US"/>
+        </w:rPr>
+        <w:t>]</w:t>
+      </w:r>
+      <w:r>
+        <w:rPr>
+          <w:rFonts w:ascii="Times New Roman" w:hAnsi="Times New Roman" w:cs="Times New Roman"/>
+          <w:lang w:val="en-US"/>
+        </w:rPr>
+        <w:t xml:space="preserve"> C. Morariu y T. </w:t>
       </w:r>
       <w:proofErr w:type="spellStart"/>
       <w:r>
@@ -6900,7 +9011,28 @@
           <w:rFonts w:ascii="Times New Roman" w:hAnsi="Times New Roman" w:cs="Times New Roman"/>
           <w:lang w:val="en-US"/>
         </w:rPr>
-        <w:t xml:space="preserve">[J9F5][9] R. Mehta, “Strategic Integration of ERP and Manufacturing Information Systems: Overcoming Implementation Challenges and Driving Digital Transformation,” </w:t>
+        <w:t>[</w:t>
+      </w:r>
+      <w:r>
+        <w:rPr>
+          <w:rFonts w:ascii="Times New Roman" w:hAnsi="Times New Roman" w:cs="Times New Roman"/>
+          <w:lang w:val="en-US"/>
+        </w:rPr>
+        <w:t>9</w:t>
+      </w:r>
+      <w:r>
+        <w:rPr>
+          <w:rFonts w:ascii="Times New Roman" w:hAnsi="Times New Roman" w:cs="Times New Roman"/>
+          <w:lang w:val="en-US"/>
+        </w:rPr>
+        <w:t>]</w:t>
+      </w:r>
+      <w:r>
+        <w:rPr>
+          <w:rFonts w:ascii="Times New Roman" w:hAnsi="Times New Roman" w:cs="Times New Roman"/>
+          <w:lang w:val="en-US"/>
+        </w:rPr>
+        <w:t xml:space="preserve"> R. Mehta, “Strategic Integration of ERP and Manufacturing Information Systems: Overcoming Implementation Challenges and Driving Digital Transformation,” </w:t>
       </w:r>
       <w:r>
         <w:rPr>
@@ -6958,7 +9090,28 @@
           <w:rFonts w:ascii="Times New Roman" w:hAnsi="Times New Roman" w:cs="Times New Roman"/>
           <w:lang w:val="en-US"/>
         </w:rPr>
-        <w:t xml:space="preserve">[E6M1][10] V. M. </w:t>
+        <w:t>[</w:t>
+      </w:r>
+      <w:r>
+        <w:rPr>
+          <w:rFonts w:ascii="Times New Roman" w:hAnsi="Times New Roman" w:cs="Times New Roman"/>
+          <w:lang w:val="en-US"/>
+        </w:rPr>
+        <w:t>10</w:t>
+      </w:r>
+      <w:r>
+        <w:rPr>
+          <w:rFonts w:ascii="Times New Roman" w:hAnsi="Times New Roman" w:cs="Times New Roman"/>
+          <w:lang w:val="en-US"/>
+        </w:rPr>
+        <w:t>]</w:t>
+      </w:r>
+      <w:r>
+        <w:rPr>
+          <w:rFonts w:ascii="Times New Roman" w:hAnsi="Times New Roman" w:cs="Times New Roman"/>
+          <w:lang w:val="en-US"/>
+        </w:rPr>
+        <w:t xml:space="preserve"> V. M. </w:t>
       </w:r>
       <w:proofErr w:type="spellStart"/>
       <w:r>
@@ -6999,8 +9152,17 @@
           <w:iCs/>
           <w:lang w:val="en-US"/>
         </w:rPr>
+        <w:t xml:space="preserve">Computers &amp; Industrial </w:t>
+      </w:r>
+      <w:r>
+        <w:rPr>
+          <w:rFonts w:ascii="Times New Roman" w:hAnsi="Times New Roman" w:cs="Times New Roman"/>
+          <w:i/>
+          <w:iCs/>
+          <w:lang w:val="en-US"/>
+        </w:rPr>
         <w:lastRenderedPageBreak/>
-        <w:t>Computers &amp; Industrial Engineering</w:t>
+        <w:t>Engineering</w:t>
       </w:r>
       <w:r>
         <w:rPr>
@@ -7049,7 +9211,28 @@
           <w:rFonts w:ascii="Times New Roman" w:hAnsi="Times New Roman" w:cs="Times New Roman"/>
           <w:lang w:val="en-US"/>
         </w:rPr>
-        <w:t xml:space="preserve">[U3K7][11] F. A. Osman, M. Y. M. Hashem y M. A. R. </w:t>
+        <w:t>[</w:t>
+      </w:r>
+      <w:r>
+        <w:rPr>
+          <w:rFonts w:ascii="Times New Roman" w:hAnsi="Times New Roman" w:cs="Times New Roman"/>
+          <w:lang w:val="en-US"/>
+        </w:rPr>
+        <w:t>11</w:t>
+      </w:r>
+      <w:r>
+        <w:rPr>
+          <w:rFonts w:ascii="Times New Roman" w:hAnsi="Times New Roman" w:cs="Times New Roman"/>
+          <w:lang w:val="en-US"/>
+        </w:rPr>
+        <w:t>]</w:t>
+      </w:r>
+      <w:r>
+        <w:rPr>
+          <w:rFonts w:ascii="Times New Roman" w:hAnsi="Times New Roman" w:cs="Times New Roman"/>
+          <w:lang w:val="en-US"/>
+        </w:rPr>
+        <w:t xml:space="preserve"> F. A. Osman, M. Y. M. Hashem y M. A. R. </w:t>
       </w:r>
       <w:proofErr w:type="spellStart"/>
       <w:r>
@@ -7123,7 +9306,28 @@
           <w:rFonts w:ascii="Times New Roman" w:hAnsi="Times New Roman" w:cs="Times New Roman"/>
           <w:lang w:val="en-US"/>
         </w:rPr>
-        <w:t xml:space="preserve">[L6C2][12] N.-Z. Hu, Y.-X. Lin, H.-L. Huang, P.-H. Lu, C.-C. Lin, Y.-T. Hung, S.-C. Jhang y P.-Y. Chou, “Applying Model Context Protocol for Offline Small Language Models in Industrial Data Management,” </w:t>
+        <w:t>[</w:t>
+      </w:r>
+      <w:r>
+        <w:rPr>
+          <w:rFonts w:ascii="Times New Roman" w:hAnsi="Times New Roman" w:cs="Times New Roman"/>
+          <w:lang w:val="en-US"/>
+        </w:rPr>
+        <w:t>12</w:t>
+      </w:r>
+      <w:r>
+        <w:rPr>
+          <w:rFonts w:ascii="Times New Roman" w:hAnsi="Times New Roman" w:cs="Times New Roman"/>
+          <w:lang w:val="en-US"/>
+        </w:rPr>
+        <w:t>]</w:t>
+      </w:r>
+      <w:r>
+        <w:rPr>
+          <w:rFonts w:ascii="Times New Roman" w:hAnsi="Times New Roman" w:cs="Times New Roman"/>
+          <w:lang w:val="en-US"/>
+        </w:rPr>
+        <w:t xml:space="preserve"> N.-Z. Hu, Y.-X. Lin, H.-L. Huang, P.-H. Lu, C.-C. Lin, Y.-T. Hung, S.-C. Jhang y P.-Y. Chou, “Applying Model Context Protocol for Offline Small Language Models in Industrial Data Management,” </w:t>
       </w:r>
       <w:r>
         <w:rPr>
@@ -7181,7 +9385,28 @@
           <w:rFonts w:ascii="Times New Roman" w:hAnsi="Times New Roman" w:cs="Times New Roman"/>
           <w:lang w:val="en-US"/>
         </w:rPr>
-        <w:t xml:space="preserve">[U2M5][13] M. Hoffmann, P. Thomas, D. Schütz, B. Vogel-Heuser, T. Meisen y S. Jeschke, “Semantic Integration of Multi-Agent Systems using an OPC UA Information Modeling Approach,” </w:t>
+        <w:t>[</w:t>
+      </w:r>
+      <w:r>
+        <w:rPr>
+          <w:rFonts w:ascii="Times New Roman" w:hAnsi="Times New Roman" w:cs="Times New Roman"/>
+          <w:lang w:val="en-US"/>
+        </w:rPr>
+        <w:t>13</w:t>
+      </w:r>
+      <w:r>
+        <w:rPr>
+          <w:rFonts w:ascii="Times New Roman" w:hAnsi="Times New Roman" w:cs="Times New Roman"/>
+          <w:lang w:val="en-US"/>
+        </w:rPr>
+        <w:t>]</w:t>
+      </w:r>
+      <w:r>
+        <w:rPr>
+          <w:rFonts w:ascii="Times New Roman" w:hAnsi="Times New Roman" w:cs="Times New Roman"/>
+          <w:lang w:val="en-US"/>
+        </w:rPr>
+        <w:t xml:space="preserve"> M. Hoffmann, P. Thomas, D. Schütz, B. Vogel-Heuser, T. Meisen y S. Jeschke, “Semantic Integration of Multi-Agent Systems using an OPC UA Information Modeling Approach,” </w:t>
       </w:r>
       <w:proofErr w:type="spellStart"/>
       <w:r>
@@ -7255,7 +9480,28 @@
           <w:rFonts w:ascii="Times New Roman" w:hAnsi="Times New Roman" w:cs="Times New Roman"/>
           <w:lang w:val="en-US"/>
         </w:rPr>
-        <w:t xml:space="preserve">[F6I1][14] B. Chen, J. Wan, L. Shu, P. Li, M. Mukherjee y B. Yin, “Smart factory of industry 4.0: Key technologies, application case, and challenges,” </w:t>
+        <w:t>[</w:t>
+      </w:r>
+      <w:r>
+        <w:rPr>
+          <w:rFonts w:ascii="Times New Roman" w:hAnsi="Times New Roman" w:cs="Times New Roman"/>
+          <w:lang w:val="en-US"/>
+        </w:rPr>
+        <w:t>14</w:t>
+      </w:r>
+      <w:r>
+        <w:rPr>
+          <w:rFonts w:ascii="Times New Roman" w:hAnsi="Times New Roman" w:cs="Times New Roman"/>
+          <w:lang w:val="en-US"/>
+        </w:rPr>
+        <w:t>]</w:t>
+      </w:r>
+      <w:r>
+        <w:rPr>
+          <w:rFonts w:ascii="Times New Roman" w:hAnsi="Times New Roman" w:cs="Times New Roman"/>
+          <w:lang w:val="en-US"/>
+        </w:rPr>
+        <w:t xml:space="preserve"> B. Chen, J. Wan, L. Shu, P. Li, M. Mukherjee y B. Yin, “Smart factory of industry 4.0: Key technologies, application case, and challenges,” </w:t>
       </w:r>
       <w:r>
         <w:rPr>
@@ -7312,7 +9558,28 @@
           <w:rFonts w:ascii="Times New Roman" w:hAnsi="Times New Roman" w:cs="Times New Roman"/>
           <w:lang w:val="en-US"/>
         </w:rPr>
-        <w:t xml:space="preserve">[P1R5][15] B. Kitchenham, “Procedures for Performing Systematic Reviews,” </w:t>
+        <w:t>[</w:t>
+      </w:r>
+      <w:r>
+        <w:rPr>
+          <w:rFonts w:ascii="Times New Roman" w:hAnsi="Times New Roman" w:cs="Times New Roman"/>
+          <w:lang w:val="en-US"/>
+        </w:rPr>
+        <w:t>15</w:t>
+      </w:r>
+      <w:r>
+        <w:rPr>
+          <w:rFonts w:ascii="Times New Roman" w:hAnsi="Times New Roman" w:cs="Times New Roman"/>
+          <w:lang w:val="en-US"/>
+        </w:rPr>
+        <w:t>]</w:t>
+      </w:r>
+      <w:r>
+        <w:rPr>
+          <w:rFonts w:ascii="Times New Roman" w:hAnsi="Times New Roman" w:cs="Times New Roman"/>
+          <w:lang w:val="en-US"/>
+        </w:rPr>
+        <w:t xml:space="preserve"> B. Kitchenham, “Procedures for Performing Systematic Reviews,” </w:t>
       </w:r>
       <w:r>
         <w:rPr>
@@ -7359,7 +9626,28 @@
           <w:rFonts w:ascii="Times New Roman" w:hAnsi="Times New Roman" w:cs="Times New Roman"/>
           <w:lang w:val="en-US"/>
         </w:rPr>
-        <w:t xml:space="preserve">[P8S2][16] M. J. Page, J. E. McKenzie, P. M. Bossuyt, I. </w:t>
+        <w:t>[</w:t>
+      </w:r>
+      <w:r>
+        <w:rPr>
+          <w:rFonts w:ascii="Times New Roman" w:hAnsi="Times New Roman" w:cs="Times New Roman"/>
+          <w:lang w:val="en-US"/>
+        </w:rPr>
+        <w:t>16</w:t>
+      </w:r>
+      <w:r>
+        <w:rPr>
+          <w:rFonts w:ascii="Times New Roman" w:hAnsi="Times New Roman" w:cs="Times New Roman"/>
+          <w:lang w:val="en-US"/>
+        </w:rPr>
+        <w:t>]</w:t>
+      </w:r>
+      <w:r>
+        <w:rPr>
+          <w:rFonts w:ascii="Times New Roman" w:hAnsi="Times New Roman" w:cs="Times New Roman"/>
+          <w:lang w:val="en-US"/>
+        </w:rPr>
+        <w:t xml:space="preserve"> M. J. Page, J. E. McKenzie, P. M. Bossuyt, I. </w:t>
       </w:r>
       <w:proofErr w:type="spellStart"/>
       <w:r>
@@ -7464,7 +9752,28 @@
           <w:rFonts w:ascii="Times New Roman" w:hAnsi="Times New Roman" w:cs="Times New Roman"/>
           <w:lang w:val="en-US"/>
         </w:rPr>
-        <w:t xml:space="preserve">[K7H4][17] B. Kitchenham y S. Charters, “Guidelines for Performing Systematic Literature Reviews in Software Engineering,” </w:t>
+        <w:t>[</w:t>
+      </w:r>
+      <w:r>
+        <w:rPr>
+          <w:rFonts w:ascii="Times New Roman" w:hAnsi="Times New Roman" w:cs="Times New Roman"/>
+          <w:lang w:val="en-US"/>
+        </w:rPr>
+        <w:t>17</w:t>
+      </w:r>
+      <w:r>
+        <w:rPr>
+          <w:rFonts w:ascii="Times New Roman" w:hAnsi="Times New Roman" w:cs="Times New Roman"/>
+          <w:lang w:val="en-US"/>
+        </w:rPr>
+        <w:t>]</w:t>
+      </w:r>
+      <w:r>
+        <w:rPr>
+          <w:rFonts w:ascii="Times New Roman" w:hAnsi="Times New Roman" w:cs="Times New Roman"/>
+          <w:lang w:val="en-US"/>
+        </w:rPr>
+        <w:t xml:space="preserve"> B. Kitchenham y S. Charters, “Guidelines for Performing Systematic Literature Reviews in Software Engineering,” </w:t>
       </w:r>
       <w:r>
         <w:rPr>
@@ -7510,7 +9819,28 @@
           <w:rFonts w:ascii="Times New Roman" w:hAnsi="Times New Roman" w:cs="Times New Roman"/>
           <w:lang w:val="en-US"/>
         </w:rPr>
-        <w:t xml:space="preserve">[P2A6][18] Parsifal, “Parsifal - The web app designed to support the systematic review process in Software Engineering,” </w:t>
+        <w:t>[</w:t>
+      </w:r>
+      <w:r>
+        <w:rPr>
+          <w:rFonts w:ascii="Times New Roman" w:hAnsi="Times New Roman" w:cs="Times New Roman"/>
+          <w:lang w:val="en-US"/>
+        </w:rPr>
+        <w:t>18</w:t>
+      </w:r>
+      <w:r>
+        <w:rPr>
+          <w:rFonts w:ascii="Times New Roman" w:hAnsi="Times New Roman" w:cs="Times New Roman"/>
+          <w:lang w:val="en-US"/>
+        </w:rPr>
+        <w:t>]</w:t>
+      </w:r>
+      <w:r>
+        <w:rPr>
+          <w:rFonts w:ascii="Times New Roman" w:hAnsi="Times New Roman" w:cs="Times New Roman"/>
+          <w:lang w:val="en-US"/>
+        </w:rPr>
+        <w:t xml:space="preserve"> Parsifal, “Parsifal - The web app designed to support the systematic review process in Software Engineering,” </w:t>
       </w:r>
       <w:proofErr w:type="spellStart"/>
       <w:r>
@@ -7571,7 +9901,25 @@
         <w:rPr>
           <w:rFonts w:ascii="Times New Roman" w:hAnsi="Times New Roman" w:cs="Times New Roman"/>
         </w:rPr>
-        <w:t>[V9S4][19] N. J. van Eck y L. Waltman, “</w:t>
+        <w:t>[</w:t>
+      </w:r>
+      <w:r>
+        <w:rPr>
+          <w:rFonts w:ascii="Times New Roman" w:hAnsi="Times New Roman" w:cs="Times New Roman"/>
+        </w:rPr>
+        <w:t>19</w:t>
+      </w:r>
+      <w:r>
+        <w:rPr>
+          <w:rFonts w:ascii="Times New Roman" w:hAnsi="Times New Roman" w:cs="Times New Roman"/>
+        </w:rPr>
+        <w:t>]</w:t>
+      </w:r>
+      <w:r>
+        <w:rPr>
+          <w:rFonts w:ascii="Times New Roman" w:hAnsi="Times New Roman" w:cs="Times New Roman"/>
+        </w:rPr>
+        <w:t xml:space="preserve"> N. J. van Eck y L. Waltman, “</w:t>
       </w:r>
       <w:proofErr w:type="spellStart"/>
       <w:r>
@@ -8259,6 +10607,7 @@
   <w:style w:type="character" w:default="1" w:styleId="Fuentedeprrafopredeter">
     <w:name w:val="Default Paragraph Font"/>
     <w:uiPriority w:val="1"/>
+    <w:semiHidden/>
     <w:unhideWhenUsed/>
   </w:style>
   <w:style w:type="table" w:default="1" w:styleId="Tablanormal">

</xml_diff>